<commit_message>
SC growth-infrastructure-roads: cross-check [P-...] blocks against uploaded Phase 2 Grid View v2 source — 6 of 7 verified, Charleston consensus detail added, blank developer-pays detail table flagged for human review; renders rebuilt
Co-authored-by: CaptainWrechols <CaptainWrechols@users.noreply.github.com>
</commit_message>
<xml_diff>
--- a/briefs/south-carolina/growth-infrastructure-roads/citizen-v2/appendices/appendices.docx
+++ b/briefs/south-carolina/growth-infrastructure-roads/citizen-v2/appendices/appendices.docx
@@ -40031,6 +40031,74 @@
         <w:t xml:space="preserve">appendix matches each proposal against the 2019–2026 legislative record.</w:t>
       </w:r>
     </w:p>
+    <w:p>
+      <w:pPr>
+        <w:pStyle w:val="BodyText"/>
+      </w:pPr>
+      <w:r>
+        <w:t xml:space="preserve">Source-document cross-check (2026-09-01): the frequency, tradeoff, and</w:t>
+      </w:r>
+      <w:r>
+        <w:t xml:space="preserve"> </w:t>
+      </w:r>
+      <w:r>
+        <w:t xml:space="preserve">consensus descriptions below were verified against the</w:t>
+      </w:r>
+      <w:r>
+        <w:t xml:space="preserve"> </w:t>
+      </w:r>
+      <w:r>
+        <w:t xml:space="preserve">“</w:t>
+      </w:r>
+      <w:r>
+        <w:t xml:space="preserve">SC1 – Phase 2</w:t>
+      </w:r>
+      <w:r>
+        <w:t xml:space="preserve"> </w:t>
+      </w:r>
+      <w:r>
+        <w:t xml:space="preserve">Constituent Proposals – Grid View for Legislators v2</w:t>
+      </w:r>
+      <w:r>
+        <w:t xml:space="preserve">”</w:t>
+      </w:r>
+      <w:r>
+        <w:t xml:space="preserve"> </w:t>
+      </w:r>
+      <w:r>
+        <w:t xml:space="preserve">document. Six of the</w:t>
+      </w:r>
+      <w:r>
+        <w:t xml:space="preserve"> </w:t>
+      </w:r>
+      <w:r>
+        <w:t xml:space="preserve">seven match it verbatim in substance. The exception is developer-pays-growth:</w:t>
+      </w:r>
+      <w:r>
+        <w:t xml:space="preserve"> </w:t>
+      </w:r>
+      <w:r>
+        <w:t xml:space="preserve">its detail table (frequency/tradeoffs/consensus) is blank in the v2 document</w:t>
+      </w:r>
+      <w:r>
+        <w:t xml:space="preserve"> </w:t>
+      </w:r>
+      <w:r>
+        <w:t xml:space="preserve">— the proposal itself appears in the document’s legislator-feedback grid, but</w:t>
+      </w:r>
+      <w:r>
+        <w:t xml:space="preserve"> </w:t>
+      </w:r>
+      <w:r>
+        <w:t xml:space="preserve">its attributes here rest on the issue config’s proposal block alone. Flagged</w:t>
+      </w:r>
+      <w:r>
+        <w:t xml:space="preserve"> </w:t>
+      </w:r>
+      <w:r>
+        <w:t xml:space="preserve">for human review.</w:t>
+      </w:r>
+    </w:p>
     <w:bookmarkStart w:id="72" w:name="X29479f5a116f5e4dbe89e8398989426b36902fe"/>
     <w:p>
       <w:pPr>
@@ -40479,7 +40547,19 @@
         <w:t xml:space="preserve"> </w:t>
       </w:r>
       <w:r>
-        <w:t xml:space="preserve">home-rule tension (local control versus state authority) runs through it.</w:t>
+        <w:t xml:space="preserve">home-rule tension (local control versus state authority) runs through it,</w:t>
+      </w:r>
+      <w:r>
+        <w:t xml:space="preserve"> </w:t>
+      </w:r>
+      <w:r>
+        <w:t xml:space="preserve">though it was adopted as a consensus recommendation at the Charleston</w:t>
+      </w:r>
+      <w:r>
+        <w:t xml:space="preserve"> </w:t>
+      </w:r>
+      <w:r>
+        <w:t xml:space="preserve">conversation (process input).</w:t>
       </w:r>
     </w:p>
     <w:p>
@@ -41412,7 +41492,7 @@
               <w:t xml:space="preserve"> </w:t>
             </w:r>
             <w:r>
-              <w:t xml:space="preserve">via the issue config — process input, not verified fact</w:t>
+              <w:t xml:space="preserve">via the issue config — process input, not verified fact. Cross-checked against the source document itself on 2026-09-01: six of seven proposal blocks verify (frequency/tradeoffs/consensus); the developer-pays-growth detail table is blank in the v2 document, so its attributes rest on the config’s proposal block alone (noted in Appendix H)</w:t>
             </w:r>
           </w:p>
         </w:tc>

</xml_diff>

<commit_message>
SC growth-infrastructure-roads: independent fact-check — 107/107 live checks vs scstatehouse.gov/SC Code + secondary sources; Act 177 omnibus scope correction (Pothole Mitigation Program, design-build/CMGC, choice lanes, P3 cap, 4-year audit, C-funds 33%) propagated through brief, spotlights, appendices, working chain; renders rebuilt and 2pp front brief re-verified
Co-authored-by: CaptainWrechols <CaptainWrechols@users.noreply.github.com>
</commit_message>
<xml_diff>
--- a/briefs/south-carolina/growth-infrastructure-roads/citizen-v2/appendices/appendices.docx
+++ b/briefs/south-carolina/growth-infrastructure-roads/citizen-v2/appendices/appendices.docx
@@ -7702,7 +7702,40 @@
               <w:jc w:val="left"/>
             </w:pPr>
             <w:r>
-              <w:t xml:space="preserve">The SCDOT Modernization Act (Act 177 of 2026): the Governor now appoints the Secretary of Transportation, and the seven-member SCDOT Commission’s duties devolve to the secretary - the biggest governance change in this record.</w:t>
+              <w:t xml:space="preserve">The SCDOT Modernization Act (Act 177 of 2026): the Governor now appoints the Secretary of Transportation and the seven-member commission is abolished January 1, 2027, its duties devolved to the secretary - plus a Pothole Mitigation Program (seven-day repairs, $15 million a year), phased design-build contracting,</w:t>
+            </w:r>
+            <w:r>
+              <w:t xml:space="preserve"> </w:t>
+            </w:r>
+            <w:r>
+              <w:t xml:space="preserve">‘</w:t>
+            </w:r>
+            <w:r>
+              <w:t xml:space="preserve">choice lane</w:t>
+            </w:r>
+            <w:r>
+              <w:t xml:space="preserve">’</w:t>
+            </w:r>
+            <w:r>
+              <w:t xml:space="preserve"> </w:t>
+            </w:r>
+            <w:r>
+              <w:t xml:space="preserve">toll rules, public-private partnership authority, a four-year outside audit, and a rewritten county</w:t>
+            </w:r>
+            <w:r>
+              <w:t xml:space="preserve"> </w:t>
+            </w:r>
+            <w:r>
+              <w:t xml:space="preserve">‘</w:t>
+            </w:r>
+            <w:r>
+              <w:t xml:space="preserve">C</w:t>
+            </w:r>
+            <w:r>
+              <w:t xml:space="preserve">’</w:t>
+            </w:r>
+            <w:r>
+              <w:t xml:space="preserve">-funds split.</w:t>
             </w:r>
           </w:p>
         </w:tc>
@@ -15110,7 +15143,25 @@
         <w:pStyle w:val="Compact"/>
       </w:pPr>
       <w:r>
-        <w:t xml:space="preserve">All five I-95 toll bills died in first committee (2019-20 S178/H3739/S780, 2023-24 S499/S674), as did the local-option gas fee (2019-20 S172).</w:t>
+        <w:t xml:space="preserve">All five I-95 toll bills died in first committee (2019-20 S178/H3739/S780, 2023-24 S499/S674), as did the local-option gas fee (2019-20 S172). The toll framework itself was then rewritten inside the SCDOT Modernization Act (Act 177 of 2026): usage charges only on new-capacity</w:t>
+      </w:r>
+      <w:r>
+        <w:t xml:space="preserve"> </w:t>
+      </w:r>
+      <w:r>
+        <w:t xml:space="preserve">“</w:t>
+      </w:r>
+      <w:r>
+        <w:t xml:space="preserve">choice lanes,</w:t>
+      </w:r>
+      <w:r>
+        <w:t xml:space="preserve">”</w:t>
+      </w:r>
+      <w:r>
+        <w:t xml:space="preserve"> </w:t>
+      </w:r>
+      <w:r>
+        <w:t xml:space="preserve">never on existing free lanes.</w:t>
       </w:r>
     </w:p>
     <w:p>
@@ -15428,7 +15479,7 @@
         <w:pStyle w:val="Compact"/>
       </w:pPr>
       <w:r>
-        <w:t xml:space="preserve">Every maintenance-accountability bill died in first committee: the pavement preservation program (2025-26 H5363), SCDOT must maintain transferred roads (2023-24 H4610), pothole hotlines (2021-22 H3871, 2023-24 H3451), sheriff road-hazard reports (2025-26 H4687), private-road maintenance (2023-24 H3516).</w:t>
+        <w:t xml:space="preserve">Every standalone maintenance-accountability bill died in first committee: the pavement preservation program (2025-26 H5363), SCDOT must maintain transferred roads (2023-24 H4610), pothole hotlines (2021-22 H3871, 2023-24 H3451), sheriff road-hazard reports (2025-26 H4687), private-road maintenance (2023-24 H3516).</w:t>
       </w:r>
     </w:p>
     <w:p>
@@ -15440,7 +15491,19 @@
         <w:pStyle w:val="Compact"/>
       </w:pPr>
       <w:r>
-        <w:t xml:space="preserve">The fix-first money moved through budget provisos instead: the yearly CTC fix-it-first rule (86.1), $417.4M in FY 2024-25, $200M in FY 2025-26, $225M in FY 2026-27, and the new Road Buyback Program (FY 2026-27 proviso 84.18). See Appendix G.</w:t>
+        <w:t xml:space="preserve">The pothole-reporting design passed inside the SCDOT Modernization Act (2025-26 S831, Act 177 of 2026): the Pothole Mitigation Program (Section 57-5-1800) — public reporting by phone, website, or a free mobile app; a seven-day repair requirement; $15,000,000 a year for full-depth repair of repeat potholes.</w:t>
+      </w:r>
+    </w:p>
+    <w:p>
+      <w:pPr>
+        <w:numPr>
+          <w:ilvl w:val="0"/>
+          <w:numId w:val="1004"/>
+        </w:numPr>
+        <w:pStyle w:val="Compact"/>
+      </w:pPr>
+      <w:r>
+        <w:t xml:space="preserve">The fix-first money moved through budget provisos: the yearly CTC fix-it-first rule (86.1), $417.4M in FY 2024-25, $200M in FY 2025-26, $225M in FY 2026-27, and the new Road Buyback Program (FY 2026-27 proviso 84.18). See Appendix G.</w:t>
       </w:r>
     </w:p>
     <w:bookmarkEnd w:id="35"/>
@@ -15526,7 +15589,7 @@
         <w:pStyle w:val="Compact"/>
       </w:pPr>
       <w:r>
-        <w:t xml:space="preserve">The governor-appoints-the-secretary design died unheard in 2019 (H3111) and 2024 (H5045, H4969) — then passed near-unanimously in 2026 as the SCDOT Modernization Act (S831, Act 177: Senate 37–1, House 114–0, conference report 112–2 and 43–0), with Senate leadership carrying it.</w:t>
+        <w:t xml:space="preserve">The governor-appoints-the-secretary design died unheard in 2019 (H3111) and 2024 (H5045, H4969) — then passed near-unanimously in 2026 as the SCDOT Modernization Act (S831, Act 177: Senate 37–1, House 114–0, conference report 112–2 and 43–0), with Senate leadership carrying it. The commission is abolished January 1, 2027.</w:t>
       </w:r>
     </w:p>
     <w:p>
@@ -15538,7 +15601,40 @@
         <w:pStyle w:val="Compact"/>
       </w:pPr>
       <w:r>
-        <w:t xml:space="preserve">The House’s own version (2025-26 H5071) was recommitted after floor debate stalled; the dissolve-the-commission bill (2025-26 H5362) and the Lieutenant-Governor-as-secretary design (2023-24 H4629, 2025-26 H3282) died in committee.</w:t>
+        <w:t xml:space="preserve">Act 177 is an omnibus, not governance alone: it also created the Pothole Mitigation Program (Section 57-5-1800), enacted phased design-build and construction manager/general contractor authority (57-5-1710/1720), rewrote toll rules around new-capacity</w:t>
+      </w:r>
+      <w:r>
+        <w:t xml:space="preserve"> </w:t>
+      </w:r>
+      <w:r>
+        <w:t xml:space="preserve">“</w:t>
+      </w:r>
+      <w:r>
+        <w:t xml:space="preserve">choice lanes,</w:t>
+      </w:r>
+      <w:r>
+        <w:t xml:space="preserve">”</w:t>
+      </w:r>
+      <w:r>
+        <w:t xml:space="preserve"> </w:t>
+      </w:r>
+      <w:r>
+        <w:t xml:space="preserve">authorized public-private partnerships up to sixty years (57-3-205), required an independent external audit of SCDOT every four years, and reset the county</w:t>
+      </w:r>
+      <w:r>
+        <w:t xml:space="preserve"> </w:t>
+      </w:r>
+      <w:r>
+        <w:t xml:space="preserve">“</w:t>
+      </w:r>
+      <w:r>
+        <w:t xml:space="preserve">C</w:t>
+      </w:r>
+      <w:r>
+        <w:t xml:space="preserve">”</w:t>
+      </w:r>
+      <w:r>
+        <w:t xml:space="preserve">-funds split to a thirty-three percent state-highway share.</w:t>
       </w:r>
     </w:p>
     <w:p>
@@ -15550,6 +15646,18 @@
         <w:pStyle w:val="Compact"/>
       </w:pPr>
       <w:r>
+        <w:t xml:space="preserve">The House’s own version (2025-26 H5071) was recommitted after floor debate stalled; the dissolve-the-commission bill (2025-26 H5362) and the Lieutenant-Governor-as-secretary design (2023-24 H4629, 2025-26 H3282) died in committee.</w:t>
+      </w:r>
+    </w:p>
+    <w:p>
+      <w:pPr>
+        <w:numPr>
+          <w:ilvl w:val="0"/>
+          <w:numId w:val="1005"/>
+        </w:numPr>
+        <w:pStyle w:val="Compact"/>
+      </w:pPr>
+      <w:r>
         <w:t xml:space="preserve">SCDOT expenditure-report certification (2021-22 H4090) died in Ways and Means; the project-prioritization regulation resolution (2019-20 H4369) passed the House 107–0 and was recommitted in the Senate.</w:t>
       </w:r>
     </w:p>
@@ -15636,7 +15744,19 @@
         <w:pStyle w:val="Compact"/>
       </w:pPr>
       <w:r>
-        <w:t xml:space="preserve">The bidding bills never reached a floor vote: design-build pilots (2023-24 H5312, 2025-26 H3560), the 2020 contractor performance-evaluation and disqualification regulation resolutions (S1069, S1070 — stranded on the Senate calendar at COVID), DBE contracting (2019-20 S385/H4401/H4823), the P3 framework (2021-22 H3559).</w:t>
+        <w:t xml:space="preserve">The standalone bidding bills never reached a floor vote: design-build pilots (2023-24 H5312, 2025-26 H3560), the 2020 contractor performance-evaluation and disqualification regulation resolutions (S1069, S1070 — stranded on the Senate calendar at COVID), DBE contracting (2019-20 S385/H4401/H4823), the P3 framework (2021-22 H3559).</w:t>
+      </w:r>
+    </w:p>
+    <w:p>
+      <w:pPr>
+        <w:numPr>
+          <w:ilvl w:val="0"/>
+          <w:numId w:val="1006"/>
+        </w:numPr>
+        <w:pStyle w:val="Compact"/>
+      </w:pPr>
+      <w:r>
+        <w:t xml:space="preserve">The method then passed inside the SCDOT Modernization Act (2025-26 S831, Act 177 of 2026): phased design-build (57-5-1710), construction manager/general contractor authority (57-5-1720), P3 agreements capped at sixty years (57-3-205), and a required independent external audit of SCDOT every four years.</w:t>
       </w:r>
     </w:p>
     <w:p>
@@ -27627,7 +27747,84 @@
           <w:iCs/>
           <w:i/>
         </w:rPr>
-        <w:t xml:space="preserve">The SCDOT Modernization Act (Act 177 of 2026): the Governor now appoints the Secretary of Transportation, and the seven-member SCDOT Commission’s duties devolve to the secretary - the biggest governance change in this record.</w:t>
+        <w:t xml:space="preserve">The SCDOT Modernization Act (Act 177 of 2026): the Governor now appoints the Secretary of Transportation and the seven-member commission is abolished January 1, 2027, its duties devolved to the secretary - plus a Pothole Mitigation Program (seven-day repairs, $15 million a year), phased design-build contracting,</w:t>
+      </w:r>
+      <w:r>
+        <w:rPr>
+          <w:iCs/>
+          <w:i/>
+        </w:rPr>
+        <w:t xml:space="preserve"> </w:t>
+      </w:r>
+      <w:r>
+        <w:rPr>
+          <w:iCs/>
+          <w:i/>
+        </w:rPr>
+        <w:t xml:space="preserve">‘</w:t>
+      </w:r>
+      <w:r>
+        <w:rPr>
+          <w:iCs/>
+          <w:i/>
+        </w:rPr>
+        <w:t xml:space="preserve">choice lane</w:t>
+      </w:r>
+      <w:r>
+        <w:rPr>
+          <w:iCs/>
+          <w:i/>
+        </w:rPr>
+        <w:t xml:space="preserve">’</w:t>
+      </w:r>
+      <w:r>
+        <w:rPr>
+          <w:iCs/>
+          <w:i/>
+        </w:rPr>
+        <w:t xml:space="preserve"> </w:t>
+      </w:r>
+      <w:r>
+        <w:rPr>
+          <w:iCs/>
+          <w:i/>
+        </w:rPr>
+        <w:t xml:space="preserve">toll rules, public-private partnership authority, a four-year outside audit, and a rewritten county</w:t>
+      </w:r>
+      <w:r>
+        <w:rPr>
+          <w:iCs/>
+          <w:i/>
+        </w:rPr>
+        <w:t xml:space="preserve"> </w:t>
+      </w:r>
+      <w:r>
+        <w:rPr>
+          <w:iCs/>
+          <w:i/>
+        </w:rPr>
+        <w:t xml:space="preserve">‘</w:t>
+      </w:r>
+      <w:r>
+        <w:rPr>
+          <w:iCs/>
+          <w:i/>
+        </w:rPr>
+        <w:t xml:space="preserve">C</w:t>
+      </w:r>
+      <w:r>
+        <w:rPr>
+          <w:iCs/>
+          <w:i/>
+        </w:rPr>
+        <w:t xml:space="preserve">’</w:t>
+      </w:r>
+      <w:r>
+        <w:rPr>
+          <w:iCs/>
+          <w:i/>
+        </w:rPr>
+        <w:t xml:space="preserve">-funds split.</w:t>
       </w:r>
       <w:r>
         <w:t xml:space="preserve"> </w:t>
@@ -40215,7 +40412,31 @@
         <w:t xml:space="preserve"> </w:t>
       </w:r>
       <w:r>
-        <w:t xml:space="preserve">edges (tourism-tax drainage repairs, beach parking, the school penny).</w:t>
+        <w:t xml:space="preserve">edges (tourism-tax drainage repairs, beach parking, the school penny),</w:t>
+      </w:r>
+      <w:r>
+        <w:t xml:space="preserve"> </w:t>
+      </w:r>
+      <w:r>
+        <w:t xml:space="preserve">and the SCDOT Modernization Act (Act 177 of 2026) rewrote the state</w:t>
+      </w:r>
+      <w:r>
+        <w:t xml:space="preserve"> </w:t>
+      </w:r>
+      <w:r>
+        <w:t xml:space="preserve">toll framework: usage charges only on new-capacity</w:t>
+      </w:r>
+      <w:r>
+        <w:t xml:space="preserve"> </w:t>
+      </w:r>
+      <w:r>
+        <w:t xml:space="preserve">“</w:t>
+      </w:r>
+      <w:r>
+        <w:t xml:space="preserve">choice lanes.</w:t>
+      </w:r>
+      <w:r>
+        <w:t xml:space="preserve">”</w:t>
       </w:r>
       <w:r>
         <w:t xml:space="preserve"> </w:t>
@@ -40705,7 +40926,7 @@
         <w:t xml:space="preserve"> </w:t>
       </w:r>
       <w:r>
-        <w:t xml:space="preserve">every maintenance-accountability bill died in</w:t>
+        <w:t xml:space="preserve">every standalone maintenance bill died in</w:t>
       </w:r>
       <w:r>
         <w:t xml:space="preserve"> </w:t>
@@ -40717,31 +40938,49 @@
         <w:t xml:space="preserve"> </w:t>
       </w:r>
       <w:r>
-        <w:t xml:space="preserve">pothole hotlines, hazard reports). The idea is real in the budget: the</w:t>
+        <w:t xml:space="preserve">pothole hotlines, hazard reports) — but the pothole-reporting design</w:t>
       </w:r>
       <w:r>
         <w:t xml:space="preserve"> </w:t>
       </w:r>
       <w:r>
-        <w:t xml:space="preserve">yearly CTC fix-it-first rule (86.1), $417.4M (FY 2024-25), $200M</w:t>
+        <w:t xml:space="preserve">became permanent law inside the SCDOT Modernization Act (Act 177 of</w:t>
       </w:r>
       <w:r>
         <w:t xml:space="preserve"> </w:t>
       </w:r>
       <w:r>
-        <w:t xml:space="preserve">(FY 2025-26), $225M (FY 2026-27) in one-time repair money, and the new</w:t>
+        <w:t xml:space="preserve">2026): the Pothole Mitigation Program, with public reporting, a</w:t>
       </w:r>
       <w:r>
         <w:t xml:space="preserve"> </w:t>
       </w:r>
       <w:r>
-        <w:t xml:space="preserve">Road Buyback Program — all one-year rules and one-time sums, not</w:t>
+        <w:t xml:space="preserve">seven-day repair requirement, and $15 million a year for repeat</w:t>
       </w:r>
       <w:r>
         <w:t xml:space="preserve"> </w:t>
       </w:r>
       <w:r>
-        <w:t xml:space="preserve">permanent law.</w:t>
+        <w:t xml:space="preserve">potholes. The rest of the idea is real in the budget: the yearly CTC</w:t>
+      </w:r>
+      <w:r>
+        <w:t xml:space="preserve"> </w:t>
+      </w:r>
+      <w:r>
+        <w:t xml:space="preserve">fix-it-first rule (86.1), $417.4M (FY 2024-25), $200M (FY 2025-26),</w:t>
+      </w:r>
+      <w:r>
+        <w:t xml:space="preserve"> </w:t>
+      </w:r>
+      <w:r>
+        <w:t xml:space="preserve">$225M (FY 2026-27) in one-time repair money, and the new Road Buyback</w:t>
+      </w:r>
+      <w:r>
+        <w:t xml:space="preserve"> </w:t>
+      </w:r>
+      <w:r>
+        <w:t xml:space="preserve">Program — one-year rules and one-time sums, not permanent law.</w:t>
       </w:r>
     </w:p>
     <w:p>
@@ -40763,7 +41002,13 @@
         <w:t xml:space="preserve"> </w:t>
       </w:r>
       <w:r>
-        <w:t xml:space="preserve">bills rarely moved; money moved through the budget.</w:t>
+        <w:t xml:space="preserve">standalone bills rarely moved; one piece enacted inside</w:t>
+      </w:r>
+      <w:r>
+        <w:t xml:space="preserve"> </w:t>
+      </w:r>
+      <w:r>
+        <w:t xml:space="preserve">Act 177; money moved through the budget.</w:t>
       </w:r>
     </w:p>
     <w:bookmarkEnd w:id="76"/>
@@ -40953,37 +41198,67 @@
         <w:t xml:space="preserve"> </w:t>
       </w:r>
       <w:r>
-        <w:t xml:space="preserve">design-build bidding died twice in committee;</w:t>
+        <w:t xml:space="preserve">the standalone design-build bills died twice</w:t>
       </w:r>
       <w:r>
         <w:t xml:space="preserve"> </w:t>
       </w:r>
       <w:r>
-        <w:t xml:space="preserve">SCDOT’s own contractor performance-evaluation and disqualification</w:t>
+        <w:t xml:space="preserve">in committee — and the method then passed inside the SCDOT Modernization</w:t>
       </w:r>
       <w:r>
         <w:t xml:space="preserve"> </w:t>
       </w:r>
       <w:r>
-        <w:t xml:space="preserve">regulations were stranded on the 2020 Senate calendar; expenditure-report</w:t>
+        <w:t xml:space="preserve">Act (Act 177 of 2026), which gave SCDOT phased design-build and</w:t>
       </w:r>
       <w:r>
         <w:t xml:space="preserve"> </w:t>
       </w:r>
       <w:r>
-        <w:t xml:space="preserve">certification died in Ways and Means. What exists today is proviso-based</w:t>
+        <w:t xml:space="preserve">construction manager/general contractor authority, capped public-private</w:t>
       </w:r>
       <w:r>
         <w:t xml:space="preserve"> </w:t>
       </w:r>
       <w:r>
-        <w:t xml:space="preserve">transparency: published project priority lists with ranking methodology</w:t>
+        <w:t xml:space="preserve">partnership agreements at sixty years, and requires an independent</w:t>
       </w:r>
       <w:r>
         <w:t xml:space="preserve"> </w:t>
       </w:r>
       <w:r>
-        <w:t xml:space="preserve">(renewed yearly) and the public project dashboard directive with</w:t>
+        <w:t xml:space="preserve">external audit of SCDOT every four years. SCDOT’s own contractor</w:t>
+      </w:r>
+      <w:r>
+        <w:t xml:space="preserve"> </w:t>
+      </w:r>
+      <w:r>
+        <w:t xml:space="preserve">performance-evaluation and disqualification regulations were stranded on</w:t>
+      </w:r>
+      <w:r>
+        <w:t xml:space="preserve"> </w:t>
+      </w:r>
+      <w:r>
+        <w:t xml:space="preserve">the 2020 Senate calendar; expenditure-report certification died in Ways</w:t>
+      </w:r>
+      <w:r>
+        <w:t xml:space="preserve"> </w:t>
+      </w:r>
+      <w:r>
+        <w:t xml:space="preserve">and Means. What exists beyond Act 177 is proviso-based transparency:</w:t>
+      </w:r>
+      <w:r>
+        <w:t xml:space="preserve"> </w:t>
+      </w:r>
+      <w:r>
+        <w:t xml:space="preserve">published project priority lists with ranking methodology (renewed</w:t>
+      </w:r>
+      <w:r>
+        <w:t xml:space="preserve"> </w:t>
+      </w:r>
+      <w:r>
+        <w:t xml:space="preserve">yearly) and the public project dashboard directive with</w:t>
       </w:r>
       <w:r>
         <w:t xml:space="preserve"> </w:t>
@@ -41029,7 +41304,13 @@
         <w:t xml:space="preserve"> </w:t>
       </w:r>
       <w:r>
-        <w:t xml:space="preserve">bills rarely moved; transparency tools exist as provisos.</w:t>
+        <w:t xml:space="preserve">standalone bills rarely moved; the bidding method and audit</w:t>
+      </w:r>
+      <w:r>
+        <w:t xml:space="preserve"> </w:t>
+      </w:r>
+      <w:r>
+        <w:t xml:space="preserve">were enacted inside Act 177; transparency tools exist as provisos.</w:t>
       </w:r>
     </w:p>
     <w:bookmarkEnd w:id="78"/>

</xml_diff>

<commit_message>
SC growth-infrastructure-roads citizen-v2.1: rework centered on the FINAL Phase 2 proposal grid ('SC1 - Growth Infrastructure Roads') — five proposals; impact-fee record folded under local-funding-tools; multimodal spotlight retired (bills remain in appendices); descriptors verbatim-faithful to the grid; config proposals updated; legislative record unchanged; renders rebuilt, 2pp front brief verified in both engines
Co-authored-by: CaptainWrechols <CaptainWrechols@users.noreply.github.com>
</commit_message>
<xml_diff>
--- a/briefs/south-carolina/growth-infrastructure-roads/citizen-v2/appendices/appendices.docx
+++ b/briefs/south-carolina/growth-infrastructure-roads/citizen-v2/appendices/appendices.docx
@@ -318,7 +318,7 @@
               <w:jc w:val="left"/>
             </w:pPr>
             <w:r>
-              <w:t xml:space="preserve">The seven Phase 2 citizen proposals [P-…] matched against the record</w:t>
+              <w:t xml:space="preserve">The five Phase 2 citizen proposals [P-…] (final grid) matched against the record</w:t>
             </w:r>
           </w:p>
         </w:tc>
@@ -38889,7 +38889,7 @@
           <w:bCs/>
           <w:b/>
         </w:rPr>
-        <w:t xml:space="preserve">The seven constituent proposals are Forum process input</w:t>
+        <w:t xml:space="preserve">The five constituent proposals are Forum process input</w:t>
       </w:r>
       <w:r>
         <w:t xml:space="preserve"> </w:t>
@@ -38901,19 +38901,61 @@
         <w:t xml:space="preserve"> </w:t>
       </w:r>
       <w:r>
-        <w:t xml:space="preserve">Phase 2 Community Conversations (June–August 2026), labeled [P-…]. They</w:t>
+        <w:t xml:space="preserve">Phase 2 Community Conversations (June–August 2026), per the final</w:t>
       </w:r>
       <w:r>
         <w:t xml:space="preserve"> </w:t>
       </w:r>
       <w:r>
+        <w:t xml:space="preserve">proposal grid (</w:t>
+      </w:r>
+      <w:r>
+        <w:t xml:space="preserve">“</w:t>
+      </w:r>
+      <w:r>
+        <w:t xml:space="preserve">SC1 - Growth Infrastructure Roads</w:t>
+      </w:r>
+      <w:r>
+        <w:t xml:space="preserve">”</w:t>
+      </w:r>
+      <w:r>
+        <w:t xml:space="preserve">), labeled [P-…]. They</w:t>
+      </w:r>
+      <w:r>
+        <w:t xml:space="preserve"> </w:t>
+      </w:r>
+      <w:r>
         <w:t xml:space="preserve">record what participants proposed — not verified facts, and not the</w:t>
       </w:r>
       <w:r>
         <w:t xml:space="preserve"> </w:t>
       </w:r>
       <w:r>
-        <w:t xml:space="preserve">Forum’s positions.</w:t>
+        <w:t xml:space="preserve">Forum’s positions. Two proposals from the earlier draft grid (a</w:t>
+      </w:r>
+      <w:r>
+        <w:t xml:space="preserve"> </w:t>
+      </w:r>
+      <w:r>
+        <w:t xml:space="preserve">standalone developer-pays proposal and a transit/multimodal proposal) are</w:t>
+      </w:r>
+      <w:r>
+        <w:t xml:space="preserve"> </w:t>
+      </w:r>
+      <w:r>
+        <w:t xml:space="preserve">not in the final grid; the impact-fee record appears under the</w:t>
+      </w:r>
+      <w:r>
+        <w:t xml:space="preserve"> </w:t>
+      </w:r>
+      <w:r>
+        <w:t xml:space="preserve">funding-tools proposal, and the transit/rail record remains in the theme</w:t>
+      </w:r>
+      <w:r>
+        <w:t xml:space="preserve"> </w:t>
+      </w:r>
+      <w:r>
+        <w:t xml:space="preserve">appendices without a proposal label.</w:t>
       </w:r>
     </w:p>
     <w:bookmarkEnd w:id="66"/>
@@ -40193,13 +40235,13 @@
     </w:p>
     <w:bookmarkEnd w:id="70"/>
     <w:bookmarkEnd w:id="71"/>
-    <w:bookmarkStart w:id="79" w:name="X52f855d2e917686a7333d5d7add35798cd9f2e4"/>
+    <w:bookmarkStart w:id="77" w:name="X4d073987b02193ee2880fbde6e270a6256cef52"/>
     <w:p>
       <w:pPr>
         <w:pStyle w:val="Heading1"/>
       </w:pPr>
       <w:r>
-        <w:t xml:space="preserve">Appendix H — The seven citizen proposals against the record</w:t>
+        <w:t xml:space="preserve">Appendix H — The five citizen proposals against the record</w:t>
       </w:r>
     </w:p>
     <w:p>
@@ -40207,25 +40249,49 @@
         <w:pStyle w:val="FirstParagraph"/>
       </w:pPr>
       <w:r>
-        <w:t xml:space="preserve">The Phase 2 Community Conversations (June–August 2026) produced seven</w:t>
+        <w:t xml:space="preserve">The Phase 2 Community Conversations (June–August 2026) produced five</w:t>
       </w:r>
       <w:r>
         <w:t xml:space="preserve"> </w:t>
       </w:r>
       <w:r>
-        <w:t xml:space="preserve">growth-and-roads proposals. They are Forum process input — what participants</w:t>
+        <w:t xml:space="preserve">growth-and-roads proposals, per the final proposal grid (</w:t>
+      </w:r>
+      <w:r>
+        <w:t xml:space="preserve">“</w:t>
+      </w:r>
+      <w:r>
+        <w:t xml:space="preserve">SC1 - Growth</w:t>
       </w:r>
       <w:r>
         <w:t xml:space="preserve"> </w:t>
       </w:r>
       <w:r>
-        <w:t xml:space="preserve">proposed, at what frequency and consensus — not verified facts. This</w:t>
+        <w:t xml:space="preserve">Infrastructure Roads</w:t>
+      </w:r>
+      <w:r>
+        <w:t xml:space="preserve">”</w:t>
+      </w:r>
+      <w:r>
+        <w:t xml:space="preserve">, received 2026-09-04). They are Forum process input —</w:t>
       </w:r>
       <w:r>
         <w:t xml:space="preserve"> </w:t>
       </w:r>
       <w:r>
-        <w:t xml:space="preserve">appendix matches each proposal against the 2019–2026 legislative record.</w:t>
+        <w:t xml:space="preserve">what participants proposed, at what frequency and consensus — not verified</w:t>
+      </w:r>
+      <w:r>
+        <w:t xml:space="preserve"> </w:t>
+      </w:r>
+      <w:r>
+        <w:t xml:space="preserve">facts. This appendix matches each proposal against the 2019–2026</w:t>
+      </w:r>
+      <w:r>
+        <w:t xml:space="preserve"> </w:t>
+      </w:r>
+      <w:r>
+        <w:t xml:space="preserve">legislative record.</w:t>
       </w:r>
     </w:p>
     <w:p>
@@ -40233,76 +40299,70 @@
         <w:pStyle w:val="BodyText"/>
       </w:pPr>
       <w:r>
-        <w:t xml:space="preserve">Source-document cross-check (2026-09-01): the frequency, tradeoff, and</w:t>
+        <w:t xml:space="preserve">Provenance note: the final grid supersedes the seven-proposal draft grid</w:t>
       </w:r>
       <w:r>
         <w:t xml:space="preserve"> </w:t>
       </w:r>
       <w:r>
-        <w:t xml:space="preserve">consensus descriptions below were verified against the</w:t>
+        <w:t xml:space="preserve">(</w:t>
+      </w:r>
+      <w:r>
+        <w:t xml:space="preserve">“</w:t>
+      </w:r>
+      <w:r>
+        <w:t xml:space="preserve">SC1 – Phase 2 Constituent Proposals – Grid View for Legislators v2</w:t>
+      </w:r>
+      <w:r>
+        <w:t xml:space="preserve">”</w:t>
+      </w:r>
+      <w:r>
+        <w:t xml:space="preserve">) this</w:t>
       </w:r>
       <w:r>
         <w:t xml:space="preserve"> </w:t>
       </w:r>
       <w:r>
-        <w:t xml:space="preserve">“</w:t>
-      </w:r>
-      <w:r>
-        <w:t xml:space="preserve">SC1 – Phase 2</w:t>
+        <w:t xml:space="preserve">issue’s config originally carried. The draft’s standalone developer-pays</w:t>
       </w:r>
       <w:r>
         <w:t xml:space="preserve"> </w:t>
       </w:r>
       <w:r>
-        <w:t xml:space="preserve">Constituent Proposals – Grid View for Legislators v2</w:t>
-      </w:r>
-      <w:r>
-        <w:t xml:space="preserve">”</w:t>
+        <w:t xml:space="preserve">proposal does not appear in the final grid — its subject, impact fees, is</w:t>
       </w:r>
       <w:r>
         <w:t xml:space="preserve"> </w:t>
       </w:r>
       <w:r>
-        <w:t xml:space="preserve">document. Six of the</w:t>
+        <w:t xml:space="preserve">named inside the funding-tools proposal and the impact-fee record is</w:t>
       </w:r>
       <w:r>
         <w:t xml:space="preserve"> </w:t>
       </w:r>
       <w:r>
-        <w:t xml:space="preserve">seven match it verbatim in substance. The exception is developer-pays-growth:</w:t>
+        <w:t xml:space="preserve">presented there. The draft’s multimodal-transport proposal was also</w:t>
       </w:r>
       <w:r>
         <w:t xml:space="preserve"> </w:t>
       </w:r>
       <w:r>
-        <w:t xml:space="preserve">its detail table (frequency/tradeoffs/consensus) is blank in the v2 document</w:t>
+        <w:t xml:space="preserve">dropped; the transit and rail legislative record remains in Appendices A–C</w:t>
       </w:r>
       <w:r>
         <w:t xml:space="preserve"> </w:t>
       </w:r>
       <w:r>
-        <w:t xml:space="preserve">— the proposal itself appears in the document’s legislator-feedback grid, but</w:t>
-      </w:r>
-      <w:r>
-        <w:t xml:space="preserve"> </w:t>
-      </w:r>
-      <w:r>
-        <w:t xml:space="preserve">its attributes here rest on the issue config’s proposal block alone. Flagged</w:t>
-      </w:r>
-      <w:r>
-        <w:t xml:space="preserve"> </w:t>
-      </w:r>
-      <w:r>
-        <w:t xml:space="preserve">for human review.</w:t>
+        <w:t xml:space="preserve">under its theme, without a proposal label.</w:t>
       </w:r>
     </w:p>
-    <w:bookmarkStart w:id="72" w:name="X29479f5a116f5e4dbe89e8398989426b36902fe"/>
+    <w:bookmarkStart w:id="72" w:name="X1534570d85845115b04e824c6c3fc2c71173db6"/>
     <w:p>
       <w:pPr>
         <w:pStyle w:val="Heading2"/>
       </w:pPr>
       <w:r>
-        <w:t xml:space="preserve">[P-local-funding-tools] New/expanded local funding tools (penny sales tax, impact fees, tolls, parking fees)</w:t>
+        <w:t xml:space="preserve">[P-local-funding-tools] New or expanded local funding tools (penny / sales tax, impact fees, tolls, parking fees)</w:t>
       </w:r>
     </w:p>
     <w:p>
@@ -40318,31 +40378,43 @@
           <w:bCs/>
           <w:b/>
         </w:rPr>
-        <w:t xml:space="preserve">What citizens said:</w:t>
+        <w:t xml:space="preserve">What citizens said (final grid):</w:t>
       </w:r>
       <w:r>
         <w:t xml:space="preserve"> </w:t>
       </w:r>
       <w:r>
-        <w:t xml:space="preserve">give local governments new or expanded funding</w:t>
+        <w:t xml:space="preserve">give local governments new or</w:t>
       </w:r>
       <w:r>
         <w:t xml:space="preserve"> </w:t>
       </w:r>
       <w:r>
-        <w:t xml:space="preserve">tools; raised in Columbia, Florence, and Charleston with high consensus.</w:t>
+        <w:t xml:space="preserve">expanded funding tools. Frequency High — Columbia, Florence, and</w:t>
       </w:r>
       <w:r>
         <w:t xml:space="preserve"> </w:t>
       </w:r>
       <w:r>
-        <w:t xml:space="preserve">Transparency on how the funds are used was the condition participants</w:t>
+        <w:t xml:space="preserve">Charleston. Consensus High — broad agreement that the state needs to look</w:t>
       </w:r>
       <w:r>
         <w:t xml:space="preserve"> </w:t>
       </w:r>
       <w:r>
-        <w:t xml:space="preserve">attached.</w:t>
+        <w:t xml:space="preserve">for new sources of funding. Tradeoff/concern: people don’t like being</w:t>
+      </w:r>
+      <w:r>
+        <w:t xml:space="preserve"> </w:t>
+      </w:r>
+      <w:r>
+        <w:t xml:space="preserve">taxed if they don’t know where the money is going — participants attached</w:t>
+      </w:r>
+      <w:r>
+        <w:t xml:space="preserve"> </w:t>
+      </w:r>
+      <w:r>
+        <w:t xml:space="preserve">the condition that any taxes come with greater transparency.</w:t>
       </w:r>
     </w:p>
     <w:p>
@@ -40358,78 +40430,78 @@
           <w:bCs/>
           <w:b/>
         </w:rPr>
-        <w:t xml:space="preserve">What the record shows:</w:t>
+        <w:t xml:space="preserve">What the record shows — the tax tools:</w:t>
       </w:r>
       <w:r>
         <w:t xml:space="preserve"> </w:t>
       </w:r>
       <w:r>
-        <w:t xml:space="preserve">the tools mostly exist — referendum-gated</w:t>
+        <w:t xml:space="preserve">the tools mostly exist —</w:t>
       </w:r>
       <w:r>
         <w:t xml:space="preserve"> </w:t>
       </w:r>
       <w:r>
-        <w:t xml:space="preserve">penny taxes for transportation (which can include tolls) and capital</w:t>
+        <w:t xml:space="preserve">referendum-gated penny taxes for transportation (which can include</w:t>
       </w:r>
       <w:r>
         <w:t xml:space="preserve"> </w:t>
       </w:r>
       <w:r>
-        <w:t xml:space="preserve">projects. Bills widening them (transit eligibility, stacking, longer</w:t>
+        <w:t xml:space="preserve">tolls) and capital projects. Bills widening them (transit eligibility,</w:t>
       </w:r>
       <w:r>
         <w:t xml:space="preserve"> </w:t>
       </w:r>
       <w:r>
-        <w:t xml:space="preserve">terms) died unheard in the money committees in all four sessions; all</w:t>
+        <w:t xml:space="preserve">stacking, longer terms, grocery carve-outs) died unheard in the money</w:t>
       </w:r>
       <w:r>
         <w:t xml:space="preserve"> </w:t>
       </w:r>
       <w:r>
-        <w:t xml:space="preserve">five I-95 toll bills and the local-option gas fee died the same way. The</w:t>
+        <w:t xml:space="preserve">committees in all four sessions; all five I-95 toll bills and the</w:t>
       </w:r>
       <w:r>
         <w:t xml:space="preserve"> </w:t>
       </w:r>
       <w:r>
-        <w:t xml:space="preserve">one new tool enacted is the County Green Space Sales Tax (Act 166 of</w:t>
-      </w:r>
-    </w:p>
-    <w:p>
-      <w:pPr>
-        <w:numPr>
-          <w:ilvl w:val="1"/>
-          <w:numId w:val="1014"/>
-        </w:numPr>
-        <w:pStyle w:val="Compact"/>
-      </w:pPr>
-      <w:r>
-        <w:t xml:space="preserve">— for preservation, not roads. Flexibility acts passed at the</w:t>
+        <w:t xml:space="preserve">local-option gas fee died the same way. The one new tool enacted is the</w:t>
       </w:r>
       <w:r>
         <w:t xml:space="preserve"> </w:t>
       </w:r>
       <w:r>
-        <w:t xml:space="preserve">edges (tourism-tax drainage repairs, beach parking, the school penny),</w:t>
+        <w:t xml:space="preserve">County Green Space Sales Tax (Act 166 of 2022) — for preservation, not</w:t>
       </w:r>
       <w:r>
         <w:t xml:space="preserve"> </w:t>
       </w:r>
       <w:r>
-        <w:t xml:space="preserve">and the SCDOT Modernization Act (Act 177 of 2026) rewrote the state</w:t>
+        <w:t xml:space="preserve">roads. Flexibility acts passed at the edges (tourism-tax drainage</w:t>
       </w:r>
       <w:r>
         <w:t xml:space="preserve"> </w:t>
       </w:r>
       <w:r>
-        <w:t xml:space="preserve">toll framework: usage charges only on new-capacity</w:t>
+        <w:t xml:space="preserve">repairs, beach parking, the school penny), and the SCDOT Modernization</w:t>
       </w:r>
       <w:r>
         <w:t xml:space="preserve"> </w:t>
       </w:r>
       <w:r>
+        <w:t xml:space="preserve">Act (Act 177 of 2026) rewrote the state toll framework: usage charges</w:t>
+      </w:r>
+      <w:r>
+        <w:t xml:space="preserve"> </w:t>
+      </w:r>
+      <w:r>
+        <w:t xml:space="preserve">only on new-capacity</w:t>
+      </w:r>
+      <w:r>
+        <w:t xml:space="preserve"> </w:t>
+      </w:r>
+      <w:r>
         <w:t xml:space="preserve">“</w:t>
       </w:r>
       <w:r>
@@ -40437,18 +40509,6 @@
       </w:r>
       <w:r>
         <w:t xml:space="preserve">”</w:t>
-      </w:r>
-      <w:r>
-        <w:t xml:space="preserve"> </w:t>
-      </w:r>
-      <w:r>
-        <w:t xml:space="preserve">The transparency condition is structurally present: every local tool</w:t>
-      </w:r>
-      <w:r>
-        <w:t xml:space="preserve"> </w:t>
-      </w:r>
-      <w:r>
-        <w:t xml:space="preserve">requires a referendum whose ballot lists the projects.</w:t>
       </w:r>
     </w:p>
     <w:p>
@@ -40464,23 +40524,287 @@
           <w:bCs/>
           <w:b/>
         </w:rPr>
+        <w:t xml:space="preserve">What the record shows — the impact-fee tool:</w:t>
+      </w:r>
+      <w:r>
+        <w:t xml:space="preserve"> </w:t>
+      </w:r>
+      <w:r>
+        <w:t xml:space="preserve">legal since 1999 (the</w:t>
+      </w:r>
+      <w:r>
+        <w:t xml:space="preserve"> </w:t>
+      </w:r>
+      <w:r>
+        <w:t xml:space="preserve">Development Impact Fee Act, Section 6-1-910 et seq.) with strict limits</w:t>
+      </w:r>
+      <w:r>
+        <w:t xml:space="preserve"> </w:t>
+      </w:r>
+      <w:r>
+        <w:t xml:space="preserve">(no maintenance funding). Ten bills fought over the Act in both</w:t>
+      </w:r>
+      <w:r>
+        <w:t xml:space="preserve"> </w:t>
+      </w:r>
+      <w:r>
+        <w:t xml:space="preserve">directions — expansion and industry-side narrowing — and not one</w:t>
+      </w:r>
+      <w:r>
+        <w:t xml:space="preserve"> </w:t>
+      </w:r>
+      <w:r>
+        <w:t xml:space="preserve">received a hearing in eight years. The single enacted impact-fee rule</w:t>
+      </w:r>
+      <w:r>
+        <w:t xml:space="preserve"> </w:t>
+      </w:r>
+      <w:r>
+        <w:t xml:space="preserve">blocked the fees (the FY 2021-22 school-construction prohibition, one</w:t>
+      </w:r>
+      <w:r>
+        <w:t xml:space="preserve"> </w:t>
+      </w:r>
+      <w:r>
+        <w:t xml:space="preserve">year, not renewed).</w:t>
+      </w:r>
+    </w:p>
+    <w:p>
+      <w:pPr>
+        <w:numPr>
+          <w:ilvl w:val="0"/>
+          <w:numId w:val="1013"/>
+        </w:numPr>
+        <w:pStyle w:val="Compact"/>
+      </w:pPr>
+      <w:r>
+        <w:rPr>
+          <w:bCs/>
+          <w:b/>
+        </w:rPr>
+        <w:t xml:space="preserve">The transparency condition:</w:t>
+      </w:r>
+      <w:r>
+        <w:t xml:space="preserve"> </w:t>
+      </w:r>
+      <w:r>
+        <w:t xml:space="preserve">structurally present in existing law —</w:t>
+      </w:r>
+      <w:r>
+        <w:t xml:space="preserve"> </w:t>
+      </w:r>
+      <w:r>
+        <w:t xml:space="preserve">every local tax tool here requires a referendum whose ballot question</w:t>
+      </w:r>
+      <w:r>
+        <w:t xml:space="preserve"> </w:t>
+      </w:r>
+      <w:r>
+        <w:t xml:space="preserve">lists the projects the money will fund.</w:t>
+      </w:r>
+    </w:p>
+    <w:p>
+      <w:pPr>
+        <w:numPr>
+          <w:ilvl w:val="0"/>
+          <w:numId w:val="1013"/>
+        </w:numPr>
+        <w:pStyle w:val="Compact"/>
+      </w:pPr>
+      <w:r>
+        <w:rPr>
+          <w:bCs/>
+          <w:b/>
+        </w:rPr>
         <w:t xml:space="preserve">Status:</w:t>
       </w:r>
       <w:r>
         <w:t xml:space="preserve"> </w:t>
       </w:r>
       <w:r>
-        <w:t xml:space="preserve">partially existing law; expansions rarely moved.</w:t>
+        <w:t xml:space="preserve">tools partially existing law; expansions of both tools</w:t>
+      </w:r>
+      <w:r>
+        <w:t xml:space="preserve"> </w:t>
+      </w:r>
+      <w:r>
+        <w:t xml:space="preserve">rarely moved.</w:t>
       </w:r>
     </w:p>
     <w:bookmarkEnd w:id="72"/>
-    <w:bookmarkStart w:id="73" w:name="X1386a61736ef3fb590d66dad7a1c8504f075bed"/>
+    <w:bookmarkStart w:id="73" w:name="X61b0811541ace43491abbe02083fbbe9e13dafa"/>
     <w:p>
       <w:pPr>
         <w:pStyle w:val="Heading2"/>
       </w:pPr>
       <w:r>
-        <w:t xml:space="preserve">[P-developer-pays-growth] Make developers pay for growth (impact fees / proffers)</w:t>
+        <w:t xml:space="preserve">[P-state-master-planning] State comprehensive / master planning vs. fragmented county plans; regional control</w:t>
+      </w:r>
+    </w:p>
+    <w:p>
+      <w:pPr>
+        <w:numPr>
+          <w:ilvl w:val="0"/>
+          <w:numId w:val="1014"/>
+        </w:numPr>
+        <w:pStyle w:val="Compact"/>
+      </w:pPr>
+      <w:r>
+        <w:rPr>
+          <w:bCs/>
+          <w:b/>
+        </w:rPr>
+        <w:t xml:space="preserve">What citizens said (final grid):</w:t>
+      </w:r>
+      <w:r>
+        <w:t xml:space="preserve"> </w:t>
+      </w:r>
+      <w:r>
+        <w:t xml:space="preserve">state comprehensive/master planning</w:t>
+      </w:r>
+      <w:r>
+        <w:t xml:space="preserve"> </w:t>
+      </w:r>
+      <w:r>
+        <w:t xml:space="preserve">instead of fragmented county plans; regional control. Frequency Very</w:t>
+      </w:r>
+      <w:r>
+        <w:t xml:space="preserve"> </w:t>
+      </w:r>
+      <w:r>
+        <w:t xml:space="preserve">High — all four community conversations. Consensus Mixed — some cited</w:t>
+      </w:r>
+      <w:r>
+        <w:t xml:space="preserve"> </w:t>
+      </w:r>
+      <w:r>
+        <w:t xml:space="preserve">the efficiency gains from centralized planning while others remained</w:t>
+      </w:r>
+      <w:r>
+        <w:t xml:space="preserve"> </w:t>
+      </w:r>
+      <w:r>
+        <w:t xml:space="preserve">skeptical of removing local control; it was a consensus recommendation</w:t>
+      </w:r>
+      <w:r>
+        <w:t xml:space="preserve"> </w:t>
+      </w:r>
+      <w:r>
+        <w:t xml:space="preserve">in Charleston. Tradeoff/concern: removing local control could allow the</w:t>
+      </w:r>
+      <w:r>
+        <w:t xml:space="preserve"> </w:t>
+      </w:r>
+      <w:r>
+        <w:t xml:space="preserve">state to go against residents’ wishes.</w:t>
+      </w:r>
+    </w:p>
+    <w:p>
+      <w:pPr>
+        <w:numPr>
+          <w:ilvl w:val="0"/>
+          <w:numId w:val="1014"/>
+        </w:numPr>
+        <w:pStyle w:val="Compact"/>
+      </w:pPr>
+      <w:r>
+        <w:rPr>
+          <w:bCs/>
+          <w:b/>
+        </w:rPr>
+        <w:t xml:space="preserve">What the record shows:</w:t>
+      </w:r>
+      <w:r>
+        <w:t xml:space="preserve"> </w:t>
+      </w:r>
+      <w:r>
+        <w:t xml:space="preserve">the lever citizens described has never been</w:t>
+      </w:r>
+      <w:r>
+        <w:t xml:space="preserve"> </w:t>
+      </w:r>
+      <w:r>
+        <w:t xml:space="preserve">filed — no state- or regional-planning bill exists in this record. What</w:t>
+      </w:r>
+      <w:r>
+        <w:t xml:space="preserve"> </w:t>
+      </w:r>
+      <w:r>
+        <w:t xml:space="preserve">exists: one enacted state layer on local plans (the resilience act,</w:t>
+      </w:r>
+      <w:r>
+        <w:t xml:space="preserve"> </w:t>
+      </w:r>
+      <w:r>
+        <w:t xml:space="preserve">Act 163 of 2020), the concurrency bills (S227 died at the last step in</w:t>
+      </w:r>
+      <w:r>
+        <w:t xml:space="preserve"> </w:t>
+      </w:r>
+      <w:r>
+        <w:t xml:space="preserve">2026), zoning-impact-assessment and annexation-control bills (all died in</w:t>
+      </w:r>
+      <w:r>
+        <w:t xml:space="preserve"> </w:t>
+      </w:r>
+      <w:r>
+        <w:t xml:space="preserve">committee), and a developer-side counter-current pulling the opposite</w:t>
+      </w:r>
+      <w:r>
+        <w:t xml:space="preserve"> </w:t>
+      </w:r>
+      <w:r>
+        <w:t xml:space="preserve">direction (also died). The one enacted state-over-local land-use rule is</w:t>
+      </w:r>
+      <w:r>
+        <w:t xml:space="preserve"> </w:t>
+      </w:r>
+      <w:r>
+        <w:t xml:space="preserve">the 5G small-cell act (Act 179 of 2020). The record mirrors the</w:t>
+      </w:r>
+      <w:r>
+        <w:t xml:space="preserve"> </w:t>
+      </w:r>
+      <w:r>
+        <w:t xml:space="preserve">tradeoff citizens named: bills pulling toward state authority and bills</w:t>
+      </w:r>
+      <w:r>
+        <w:t xml:space="preserve"> </w:t>
+      </w:r>
+      <w:r>
+        <w:t xml:space="preserve">pulling toward local/developer flexibility died in the same committees.</w:t>
+      </w:r>
+    </w:p>
+    <w:p>
+      <w:pPr>
+        <w:numPr>
+          <w:ilvl w:val="0"/>
+          <w:numId w:val="1014"/>
+        </w:numPr>
+        <w:pStyle w:val="Compact"/>
+      </w:pPr>
+      <w:r>
+        <w:rPr>
+          <w:bCs/>
+          <w:b/>
+        </w:rPr>
+        <w:t xml:space="preserve">Status:</w:t>
+      </w:r>
+      <w:r>
+        <w:t xml:space="preserve"> </w:t>
+      </w:r>
+      <w:r>
+        <w:t xml:space="preserve">never filed (as described); adjacent designs mixed.</w:t>
+      </w:r>
+    </w:p>
+    <w:bookmarkEnd w:id="73"/>
+    <w:bookmarkStart w:id="74" w:name="X9b24152898da276ec821145dd7f9cd28e71d6d1"/>
+    <w:p>
+      <w:pPr>
+        <w:pStyle w:val="Heading2"/>
+      </w:pPr>
+      <w:r>
+        <w:t xml:space="preserve">[P-fix-roads-first] Fix the roads we’ve got first</w:t>
       </w:r>
     </w:p>
     <w:p>
@@ -40496,25 +40820,49 @@
           <w:bCs/>
           <w:b/>
         </w:rPr>
-        <w:t xml:space="preserve">What citizens said:</w:t>
+        <w:t xml:space="preserve">What citizens said (final grid):</w:t>
       </w:r>
       <w:r>
         <w:t xml:space="preserve"> </w:t>
       </w:r>
       <w:r>
-        <w:t xml:space="preserve">make developers pay for the infrastructure</w:t>
+        <w:t xml:space="preserve">prioritize the roads we already</w:t>
       </w:r>
       <w:r>
         <w:t xml:space="preserve"> </w:t>
       </w:r>
       <w:r>
-        <w:t xml:space="preserve">their projects create demand for; raised at all events, high consensus;</w:t>
+        <w:t xml:space="preserve">have. Frequency Medium — Columbia and the online session. Consensus</w:t>
       </w:r>
       <w:r>
         <w:t xml:space="preserve"> </w:t>
       </w:r>
       <w:r>
-        <w:t xml:space="preserve">pass-through to home prices the named concern.</w:t>
+        <w:t xml:space="preserve">Mixed — broad agreement that maintenance needs to be factored in, but</w:t>
+      </w:r>
+      <w:r>
+        <w:t xml:space="preserve"> </w:t>
+      </w:r>
+      <w:r>
+        <w:t xml:space="preserve">many participants want to see expanded infrastructure. Tradeoff/concern:</w:t>
+      </w:r>
+      <w:r>
+        <w:t xml:space="preserve"> </w:t>
+      </w:r>
+      <w:r>
+        <w:t xml:space="preserve">the expense of expansion versus maintaining what is already there; some</w:t>
+      </w:r>
+      <w:r>
+        <w:t xml:space="preserve"> </w:t>
+      </w:r>
+      <w:r>
+        <w:t xml:space="preserve">worried the state was putting too much money toward capital projects and</w:t>
+      </w:r>
+      <w:r>
+        <w:t xml:space="preserve"> </w:t>
+      </w:r>
+      <w:r>
+        <w:t xml:space="preserve">not enough toward maintenance.</w:t>
       </w:r>
     </w:p>
     <w:p>
@@ -40536,49 +40884,79 @@
         <w:t xml:space="preserve"> </w:t>
       </w:r>
       <w:r>
-        <w:t xml:space="preserve">impact fees have been legal since 1999, with</w:t>
+        <w:t xml:space="preserve">every standalone maintenance bill died in</w:t>
       </w:r>
       <w:r>
         <w:t xml:space="preserve"> </w:t>
       </w:r>
       <w:r>
-        <w:t xml:space="preserve">strict limits (no maintenance funding). Ten bills fought over the Act in</w:t>
+        <w:t xml:space="preserve">first committee (pavement preservation, transferred-roads maintenance,</w:t>
       </w:r>
       <w:r>
         <w:t xml:space="preserve"> </w:t>
       </w:r>
       <w:r>
-        <w:t xml:space="preserve">both directions — expansion and industry-side narrowing — and not one</w:t>
+        <w:t xml:space="preserve">pothole hotlines, hazard reports) — but the pothole-reporting design</w:t>
       </w:r>
       <w:r>
         <w:t xml:space="preserve"> </w:t>
       </w:r>
       <w:r>
-        <w:t xml:space="preserve">received a hearing in eight years. No proffer bill has ever been filed.</w:t>
+        <w:t xml:space="preserve">became permanent law inside the SCDOT Modernization Act (Act 177 of</w:t>
       </w:r>
       <w:r>
         <w:t xml:space="preserve"> </w:t>
       </w:r>
       <w:r>
-        <w:t xml:space="preserve">The single enacted impact-fee rule blocked the fees (the FY 2021-22</w:t>
+        <w:t xml:space="preserve">2026): the Pothole Mitigation Program, with public reporting, a</w:t>
       </w:r>
       <w:r>
         <w:t xml:space="preserve"> </w:t>
       </w:r>
       <w:r>
-        <w:t xml:space="preserve">school-construction prohibition, one year). The adjacent concurrency</w:t>
+        <w:t xml:space="preserve">seven-day repair requirement, and $15 million a year for repeat</w:t>
       </w:r>
       <w:r>
         <w:t xml:space="preserve"> </w:t>
       </w:r>
       <w:r>
-        <w:t xml:space="preserve">design died on the Senate floor calendar in 2026 after getting further</w:t>
+        <w:t xml:space="preserve">potholes. The rest of the idea is real in the budget: the yearly CTC</w:t>
       </w:r>
       <w:r>
         <w:t xml:space="preserve"> </w:t>
       </w:r>
       <w:r>
-        <w:t xml:space="preserve">than anything else in the lane.</w:t>
+        <w:t xml:space="preserve">fix-it-first rule (86.1), $417.4M (FY 2024-25), $200M (FY 2025-26),</w:t>
+      </w:r>
+      <w:r>
+        <w:t xml:space="preserve"> </w:t>
+      </w:r>
+      <w:r>
+        <w:t xml:space="preserve">$225M (FY 2026-27) in one-time repair money, and the new Road Buyback</w:t>
+      </w:r>
+      <w:r>
+        <w:t xml:space="preserve"> </w:t>
+      </w:r>
+      <w:r>
+        <w:t xml:space="preserve">Program — one-year rules and one-time sums, not permanent law. The</w:t>
+      </w:r>
+      <w:r>
+        <w:t xml:space="preserve"> </w:t>
+      </w:r>
+      <w:r>
+        <w:t xml:space="preserve">maintenance-versus-capital worry citizens raised maps directly onto that</w:t>
+      </w:r>
+      <w:r>
+        <w:t xml:space="preserve"> </w:t>
+      </w:r>
+      <w:r>
+        <w:t xml:space="preserve">structure: the recurring maintenance rules live in one-year provisos</w:t>
+      </w:r>
+      <w:r>
+        <w:t xml:space="preserve"> </w:t>
+      </w:r>
+      <w:r>
+        <w:t xml:space="preserve">while the big sums arrive as one-time capital-style transfers.</w:t>
       </w:r>
     </w:p>
     <w:p>
@@ -40600,17 +40978,23 @@
         <w:t xml:space="preserve"> </w:t>
       </w:r>
       <w:r>
-        <w:t xml:space="preserve">existing law; every change attempt rarely moved.</w:t>
+        <w:t xml:space="preserve">standalone bills rarely moved; one piece enacted inside</w:t>
+      </w:r>
+      <w:r>
+        <w:t xml:space="preserve"> </w:t>
+      </w:r>
+      <w:r>
+        <w:t xml:space="preserve">Act 177; money moved through the budget.</w:t>
       </w:r>
     </w:p>
-    <w:bookmarkEnd w:id="73"/>
-    <w:bookmarkStart w:id="74" w:name="Xdea884646e4f16d689d9fe4117ebfd5e9ca85c7"/>
+    <w:bookmarkEnd w:id="74"/>
+    <w:bookmarkStart w:id="75" w:name="Xb903357f2ae009fc13d2b2adc9337f31734a345"/>
     <w:p>
       <w:pPr>
         <w:pStyle w:val="Heading2"/>
       </w:pPr>
       <w:r>
-        <w:t xml:space="preserve">[P-multimodal-transport] Public transit, rail, and multimodal options beyond roads</w:t>
+        <w:t xml:space="preserve">[P-no-new-taxes] No new taxes / oppose extra taxes and fees</w:t>
       </w:r>
     </w:p>
     <w:p>
@@ -40626,25 +41010,43 @@
           <w:bCs/>
           <w:b/>
         </w:rPr>
-        <w:t xml:space="preserve">What citizens said:</w:t>
+        <w:t xml:space="preserve">What citizens said (final grid):</w:t>
       </w:r>
       <w:r>
         <w:t xml:space="preserve"> </w:t>
       </w:r>
       <w:r>
-        <w:t xml:space="preserve">invest in transit, rail, and multimodal options</w:t>
+        <w:t xml:space="preserve">fund infrastructure without new</w:t>
       </w:r>
       <w:r>
         <w:t xml:space="preserve"> </w:t>
       </w:r>
       <w:r>
-        <w:t xml:space="preserve">rather than roads alone; high frequency (3 events); high consensus in</w:t>
+        <w:t xml:space="preserve">taxes or fees. Frequency Medium — multiple tables at Columbia and</w:t>
       </w:r>
       <w:r>
         <w:t xml:space="preserve"> </w:t>
       </w:r>
       <w:r>
-        <w:t xml:space="preserve">cities, rural relevance questioned.</w:t>
+        <w:t xml:space="preserve">Florence. Consensus Low — sharp disagreement over whether new taxes are</w:t>
+      </w:r>
+      <w:r>
+        <w:t xml:space="preserve"> </w:t>
+      </w:r>
+      <w:r>
+        <w:t xml:space="preserve">essential for improvements or whether keeping costs low is the priority. Tradeoff/concern: some participants argued South Carolina’s low</w:t>
+      </w:r>
+      <w:r>
+        <w:t xml:space="preserve"> </w:t>
+      </w:r>
+      <w:r>
+        <w:t xml:space="preserve">taxes are one reason infrastructure is suffering, while others want to</w:t>
+      </w:r>
+      <w:r>
+        <w:t xml:space="preserve"> </w:t>
+      </w:r>
+      <w:r>
+        <w:t xml:space="preserve">maintain the state’s low taxes.</w:t>
       </w:r>
     </w:p>
     <w:p>
@@ -40666,43 +41068,55 @@
         <w:t xml:space="preserve"> </w:t>
       </w:r>
       <w:r>
-        <w:t xml:space="preserve">zero hearings on every transit bill in four</w:t>
+        <w:t xml:space="preserve">the no-new-taxes side is fully represented —</w:t>
       </w:r>
       <w:r>
         <w:t xml:space="preserve"> </w:t>
       </w:r>
       <w:r>
-        <w:t xml:space="preserve">sessions — complete streets, transit-oriented development, developer</w:t>
+        <w:t xml:space="preserve">ten measures to freeze, repeal, or suspend the gas fee — and every one</w:t>
       </w:r>
       <w:r>
         <w:t xml:space="preserve"> </w:t>
       </w:r>
       <w:r>
-        <w:t xml:space="preserve">transit stops, rail commissions, transit studies. The one rail measure</w:t>
+        <w:t xml:space="preserve">died in the money committees without a vote, exactly like the new-tool</w:t>
       </w:r>
       <w:r>
         <w:t xml:space="preserve"> </w:t>
       </w:r>
       <w:r>
-        <w:t xml:space="preserve">with floor support moves freight (the shortline credit: House 106–3 and</w:t>
+        <w:t xml:space="preserve">bills. The one increase bill (the county gas-fee share) died in the same</w:t>
       </w:r>
       <w:r>
         <w:t xml:space="preserve"> </w:t>
       </w:r>
       <w:r>
-        <w:t xml:space="preserve">65–46, dead in Senate Finance twice). The penny-tax transit</w:t>
+        <w:t xml:space="preserve">room. The record mirrors the sharp split citizens showed: neither</w:t>
       </w:r>
       <w:r>
         <w:t xml:space="preserve"> </w:t>
       </w:r>
       <w:r>
-        <w:t xml:space="preserve">clarifications died unheard too. Enacted at the edges: transit trespass</w:t>
+        <w:t xml:space="preserve">direction has had a hearing. Where the two sides structurally meet:</w:t>
       </w:r>
       <w:r>
         <w:t xml:space="preserve"> </w:t>
       </w:r>
       <w:r>
-        <w:t xml:space="preserve">(Act 222 of 2026) and the EV-charging framework (Act 46 of 2021).</w:t>
+        <w:t xml:space="preserve">every local funding tool in the record is referendum-gated, so existing</w:t>
+      </w:r>
+      <w:r>
+        <w:t xml:space="preserve"> </w:t>
+      </w:r>
+      <w:r>
+        <w:t xml:space="preserve">law already resolves the split by letting voters decide county by</w:t>
+      </w:r>
+      <w:r>
+        <w:t xml:space="preserve"> </w:t>
+      </w:r>
+      <w:r>
+        <w:t xml:space="preserve">county.</w:t>
       </w:r>
     </w:p>
     <w:p>
@@ -40724,17 +41138,17 @@
         <w:t xml:space="preserve"> </w:t>
       </w:r>
       <w:r>
-        <w:t xml:space="preserve">rarely moved; no hearings.</w:t>
+        <w:t xml:space="preserve">rarely moved (both directions).</w:t>
       </w:r>
     </w:p>
-    <w:bookmarkEnd w:id="74"/>
-    <w:bookmarkStart w:id="75" w:name="X5090362f247d572d9534f17bfe316d81954b7e8"/>
+    <w:bookmarkEnd w:id="75"/>
+    <w:bookmarkStart w:id="76" w:name="X648ba35929f83bea307036bb6665126c35fab59"/>
     <w:p>
       <w:pPr>
         <w:pStyle w:val="Heading2"/>
       </w:pPr>
       <w:r>
-        <w:t xml:space="preserve">[P-state-master-planning] State comprehensive/regional planning instead of fragmented county plans</w:t>
+        <w:t xml:space="preserve">[P-contractor-accountability] Improve the contractor bidding process / hold contractors accountable</w:t>
       </w:r>
     </w:p>
     <w:p>
@@ -40750,37 +41164,43 @@
           <w:bCs/>
           <w:b/>
         </w:rPr>
-        <w:t xml:space="preserve">What citizens said:</w:t>
+        <w:t xml:space="preserve">What citizens said (final grid):</w:t>
       </w:r>
       <w:r>
         <w:t xml:space="preserve"> </w:t>
       </w:r>
       <w:r>
-        <w:t xml:space="preserve">move toward state or regional planning for growth</w:t>
+        <w:t xml:space="preserve">improve how road and infrastructure</w:t>
       </w:r>
       <w:r>
         <w:t xml:space="preserve"> </w:t>
       </w:r>
       <w:r>
-        <w:t xml:space="preserve">and infrastructure; raised at all four events; mixed consensus — the</w:t>
+        <w:t xml:space="preserve">contracts are bid and hold contractors accountable. Frequency Medium —</w:t>
       </w:r>
       <w:r>
         <w:t xml:space="preserve"> </w:t>
       </w:r>
       <w:r>
-        <w:t xml:space="preserve">home-rule tension (local control versus state authority) runs through it,</w:t>
+        <w:t xml:space="preserve">the online conversation and Greenville. Consensus High — participants</w:t>
       </w:r>
       <w:r>
         <w:t xml:space="preserve"> </w:t>
       </w:r>
       <w:r>
-        <w:t xml:space="preserve">though it was adopted as a consensus recommendation at the Charleston</w:t>
+        <w:t xml:space="preserve">widely agreed this could be a low-cost fix. Tradeoff/concern:</w:t>
       </w:r>
       <w:r>
         <w:t xml:space="preserve"> </w:t>
       </w:r>
       <w:r>
-        <w:t xml:space="preserve">conversation (process input).</w:t>
+        <w:t xml:space="preserve">participants felt the state was not getting quality contractors for road</w:t>
+      </w:r>
+      <w:r>
+        <w:t xml:space="preserve"> </w:t>
+      </w:r>
+      <w:r>
+        <w:t xml:space="preserve">repairs and pushed for more standards and transparency in bidding.</w:t>
       </w:r>
     </w:p>
     <w:p>
@@ -40802,49 +41222,91 @@
         <w:t xml:space="preserve"> </w:t>
       </w:r>
       <w:r>
-        <w:t xml:space="preserve">the lever citizens described has never been</w:t>
+        <w:t xml:space="preserve">the standalone design-build bills died twice</w:t>
       </w:r>
       <w:r>
         <w:t xml:space="preserve"> </w:t>
       </w:r>
       <w:r>
-        <w:t xml:space="preserve">filed — no state- or regional-planning bill exists in this record. What</w:t>
+        <w:t xml:space="preserve">in committee — and the method then passed inside the SCDOT Modernization</w:t>
       </w:r>
       <w:r>
         <w:t xml:space="preserve"> </w:t>
       </w:r>
       <w:r>
-        <w:t xml:space="preserve">exists: one enacted state layer on local plans (the resilience act,</w:t>
+        <w:t xml:space="preserve">Act (Act 177 of 2026), which gave SCDOT phased design-build and</w:t>
       </w:r>
       <w:r>
         <w:t xml:space="preserve"> </w:t>
       </w:r>
       <w:r>
-        <w:t xml:space="preserve">Act 163 of 2020), the concurrency bills (S227 died at the last step in</w:t>
+        <w:t xml:space="preserve">construction manager/general contractor authority, capped public-private</w:t>
       </w:r>
       <w:r>
         <w:t xml:space="preserve"> </w:t>
       </w:r>
       <w:r>
-        <w:t xml:space="preserve">2026), zoning-impact-assessment and annexation-control bills (all died in</w:t>
+        <w:t xml:space="preserve">partnership agreements at sixty years, and requires an independent</w:t>
       </w:r>
       <w:r>
         <w:t xml:space="preserve"> </w:t>
       </w:r>
       <w:r>
-        <w:t xml:space="preserve">committee), and a developer-side counter-current pulling the opposite</w:t>
+        <w:t xml:space="preserve">external audit of SCDOT every four years. SCDOT’s own contractor</w:t>
       </w:r>
       <w:r>
         <w:t xml:space="preserve"> </w:t>
       </w:r>
       <w:r>
-        <w:t xml:space="preserve">direction (also died). The one enacted state-over-local land-use rule is</w:t>
+        <w:t xml:space="preserve">performance-evaluation and disqualification regulations were stranded on</w:t>
       </w:r>
       <w:r>
         <w:t xml:space="preserve"> </w:t>
       </w:r>
       <w:r>
-        <w:t xml:space="preserve">the 5G small-cell act (Act 179 of 2020).</w:t>
+        <w:t xml:space="preserve">the 2020 Senate calendar; expenditure-report certification died in Ways</w:t>
+      </w:r>
+      <w:r>
+        <w:t xml:space="preserve"> </w:t>
+      </w:r>
+      <w:r>
+        <w:t xml:space="preserve">and Means. What exists beyond Act 177 is proviso-based transparency:</w:t>
+      </w:r>
+      <w:r>
+        <w:t xml:space="preserve"> </w:t>
+      </w:r>
+      <w:r>
+        <w:t xml:space="preserve">published project priority lists with ranking methodology (renewed</w:t>
+      </w:r>
+      <w:r>
+        <w:t xml:space="preserve"> </w:t>
+      </w:r>
+      <w:r>
+        <w:t xml:space="preserve">yearly) and the public project dashboard directive with</w:t>
+      </w:r>
+      <w:r>
+        <w:t xml:space="preserve"> </w:t>
+      </w:r>
+      <w:r>
+        <w:t xml:space="preserve">forecast-versus-actual costs (FY 2024-25 onward) — one-year rules that</w:t>
+      </w:r>
+      <w:r>
+        <w:t xml:space="preserve"> </w:t>
+      </w:r>
+      <w:r>
+        <w:t xml:space="preserve">lapse if a budget drops them. Edges passed as law: utility-relocation</w:t>
+      </w:r>
+      <w:r>
+        <w:t xml:space="preserve"> </w:t>
+      </w:r>
+      <w:r>
+        <w:t xml:space="preserve">costs (Act 36 of 2019, extended by Act 244 of 2026) and contractor</w:t>
+      </w:r>
+      <w:r>
+        <w:t xml:space="preserve"> </w:t>
+      </w:r>
+      <w:r>
+        <w:t xml:space="preserve">licensing (Act 69 of 2023).</w:t>
       </w:r>
     </w:p>
     <w:p>
@@ -40866,456 +41328,18 @@
         <w:t xml:space="preserve"> </w:t>
       </w:r>
       <w:r>
-        <w:t xml:space="preserve">never filed (as described); adjacent designs mixed.</w:t>
-      </w:r>
-    </w:p>
-    <w:bookmarkEnd w:id="75"/>
-    <w:bookmarkStart w:id="76" w:name="X6b3c89b442eaca67f57c69ead1b1e2192e1f290"/>
-    <w:p>
-      <w:pPr>
-        <w:pStyle w:val="Heading2"/>
-      </w:pPr>
-      <w:r>
-        <w:t xml:space="preserve">[P-fix-roads-first] Maintain existing roads before building new capacity</w:t>
-      </w:r>
-    </w:p>
-    <w:p>
-      <w:pPr>
-        <w:numPr>
-          <w:ilvl w:val="0"/>
-          <w:numId w:val="1018"/>
-        </w:numPr>
-        <w:pStyle w:val="Compact"/>
-      </w:pPr>
-      <w:r>
-        <w:rPr>
-          <w:bCs/>
-          <w:b/>
-        </w:rPr>
-        <w:t xml:space="preserve">What citizens said:</w:t>
+        <w:t xml:space="preserve">standalone bills rarely moved; the bidding method and audit</w:t>
       </w:r>
       <w:r>
         <w:t xml:space="preserve"> </w:t>
       </w:r>
       <w:r>
-        <w:t xml:space="preserve">prioritize maintaining existing roads before</w:t>
-      </w:r>
-      <w:r>
-        <w:t xml:space="preserve"> </w:t>
-      </w:r>
-      <w:r>
-        <w:t xml:space="preserve">expansion; medium frequency, mixed consensus.</w:t>
-      </w:r>
-    </w:p>
-    <w:p>
-      <w:pPr>
-        <w:numPr>
-          <w:ilvl w:val="0"/>
-          <w:numId w:val="1018"/>
-        </w:numPr>
-        <w:pStyle w:val="Compact"/>
-      </w:pPr>
-      <w:r>
-        <w:rPr>
-          <w:bCs/>
-          <w:b/>
-        </w:rPr>
-        <w:t xml:space="preserve">What the record shows:</w:t>
-      </w:r>
-      <w:r>
-        <w:t xml:space="preserve"> </w:t>
-      </w:r>
-      <w:r>
-        <w:t xml:space="preserve">every standalone maintenance bill died in</w:t>
-      </w:r>
-      <w:r>
-        <w:t xml:space="preserve"> </w:t>
-      </w:r>
-      <w:r>
-        <w:t xml:space="preserve">first committee (pavement preservation, transferred-roads maintenance,</w:t>
-      </w:r>
-      <w:r>
-        <w:t xml:space="preserve"> </w:t>
-      </w:r>
-      <w:r>
-        <w:t xml:space="preserve">pothole hotlines, hazard reports) — but the pothole-reporting design</w:t>
-      </w:r>
-      <w:r>
-        <w:t xml:space="preserve"> </w:t>
-      </w:r>
-      <w:r>
-        <w:t xml:space="preserve">became permanent law inside the SCDOT Modernization Act (Act 177 of</w:t>
-      </w:r>
-      <w:r>
-        <w:t xml:space="preserve"> </w:t>
-      </w:r>
-      <w:r>
-        <w:t xml:space="preserve">2026): the Pothole Mitigation Program, with public reporting, a</w:t>
-      </w:r>
-      <w:r>
-        <w:t xml:space="preserve"> </w:t>
-      </w:r>
-      <w:r>
-        <w:t xml:space="preserve">seven-day repair requirement, and $15 million a year for repeat</w:t>
-      </w:r>
-      <w:r>
-        <w:t xml:space="preserve"> </w:t>
-      </w:r>
-      <w:r>
-        <w:t xml:space="preserve">potholes. The rest of the idea is real in the budget: the yearly CTC</w:t>
-      </w:r>
-      <w:r>
-        <w:t xml:space="preserve"> </w:t>
-      </w:r>
-      <w:r>
-        <w:t xml:space="preserve">fix-it-first rule (86.1), $417.4M (FY 2024-25), $200M (FY 2025-26),</w:t>
-      </w:r>
-      <w:r>
-        <w:t xml:space="preserve"> </w:t>
-      </w:r>
-      <w:r>
-        <w:t xml:space="preserve">$225M (FY 2026-27) in one-time repair money, and the new Road Buyback</w:t>
-      </w:r>
-      <w:r>
-        <w:t xml:space="preserve"> </w:t>
-      </w:r>
-      <w:r>
-        <w:t xml:space="preserve">Program — one-year rules and one-time sums, not permanent law.</w:t>
-      </w:r>
-    </w:p>
-    <w:p>
-      <w:pPr>
-        <w:numPr>
-          <w:ilvl w:val="0"/>
-          <w:numId w:val="1018"/>
-        </w:numPr>
-        <w:pStyle w:val="Compact"/>
-      </w:pPr>
-      <w:r>
-        <w:rPr>
-          <w:bCs/>
-          <w:b/>
-        </w:rPr>
-        <w:t xml:space="preserve">Status:</w:t>
-      </w:r>
-      <w:r>
-        <w:t xml:space="preserve"> </w:t>
-      </w:r>
-      <w:r>
-        <w:t xml:space="preserve">standalone bills rarely moved; one piece enacted inside</w:t>
-      </w:r>
-      <w:r>
-        <w:t xml:space="preserve"> </w:t>
-      </w:r>
-      <w:r>
-        <w:t xml:space="preserve">Act 177; money moved through the budget.</w:t>
+        <w:t xml:space="preserve">were enacted inside Act 177; transparency tools exist as provisos.</w:t>
       </w:r>
     </w:p>
     <w:bookmarkEnd w:id="76"/>
-    <w:bookmarkStart w:id="77" w:name="Xaaf6e1aa66358081e41602237789e98bd862e37"/>
-    <w:p>
-      <w:pPr>
-        <w:pStyle w:val="Heading2"/>
-      </w:pPr>
-      <w:r>
-        <w:t xml:space="preserve">[P-no-new-taxes] Oppose new taxes or fees for infrastructure</w:t>
-      </w:r>
-    </w:p>
-    <w:p>
-      <w:pPr>
-        <w:numPr>
-          <w:ilvl w:val="0"/>
-          <w:numId w:val="1019"/>
-        </w:numPr>
-        <w:pStyle w:val="Compact"/>
-      </w:pPr>
-      <w:r>
-        <w:rPr>
-          <w:bCs/>
-          <w:b/>
-        </w:rPr>
-        <w:t xml:space="preserve">What citizens said:</w:t>
-      </w:r>
-      <w:r>
-        <w:t xml:space="preserve"> </w:t>
-      </w:r>
-      <w:r>
-        <w:t xml:space="preserve">fund infrastructure without new taxes or fees;</w:t>
-      </w:r>
-      <w:r>
-        <w:t xml:space="preserve"> </w:t>
-      </w:r>
-      <w:r>
-        <w:t xml:space="preserve">medium frequency, low consensus — participants split sharply, and this</w:t>
-      </w:r>
-      <w:r>
-        <w:t xml:space="preserve"> </w:t>
-      </w:r>
-      <w:r>
-        <w:t xml:space="preserve">proposal directly conflicts with local-funding-tools and developer-pays.</w:t>
-      </w:r>
-    </w:p>
-    <w:p>
-      <w:pPr>
-        <w:numPr>
-          <w:ilvl w:val="0"/>
-          <w:numId w:val="1019"/>
-        </w:numPr>
-        <w:pStyle w:val="Compact"/>
-      </w:pPr>
-      <w:r>
-        <w:rPr>
-          <w:bCs/>
-          <w:b/>
-        </w:rPr>
-        <w:t xml:space="preserve">What the record shows:</w:t>
-      </w:r>
-      <w:r>
-        <w:t xml:space="preserve"> </w:t>
-      </w:r>
-      <w:r>
-        <w:t xml:space="preserve">the no-new-taxes side is fully represented —</w:t>
-      </w:r>
-      <w:r>
-        <w:t xml:space="preserve"> </w:t>
-      </w:r>
-      <w:r>
-        <w:t xml:space="preserve">ten measures to freeze, repeal, or suspend the gas fee — and every one</w:t>
-      </w:r>
-      <w:r>
-        <w:t xml:space="preserve"> </w:t>
-      </w:r>
-      <w:r>
-        <w:t xml:space="preserve">died in the money committees without a vote, exactly like the new-tool</w:t>
-      </w:r>
-      <w:r>
-        <w:t xml:space="preserve"> </w:t>
-      </w:r>
-      <w:r>
-        <w:t xml:space="preserve">bills. The one increase bill (the county gas-fee share) died in the same</w:t>
-      </w:r>
-      <w:r>
-        <w:t xml:space="preserve"> </w:t>
-      </w:r>
-      <w:r>
-        <w:t xml:space="preserve">room. Where the two sides structurally meet: every local funding tool in</w:t>
-      </w:r>
-      <w:r>
-        <w:t xml:space="preserve"> </w:t>
-      </w:r>
-      <w:r>
-        <w:t xml:space="preserve">the record is referendum-gated, so existing law already resolves the</w:t>
-      </w:r>
-      <w:r>
-        <w:t xml:space="preserve"> </w:t>
-      </w:r>
-      <w:r>
-        <w:t xml:space="preserve">split by letting voters decide county by county.</w:t>
-      </w:r>
-    </w:p>
-    <w:p>
-      <w:pPr>
-        <w:numPr>
-          <w:ilvl w:val="0"/>
-          <w:numId w:val="1019"/>
-        </w:numPr>
-        <w:pStyle w:val="Compact"/>
-      </w:pPr>
-      <w:r>
-        <w:rPr>
-          <w:bCs/>
-          <w:b/>
-        </w:rPr>
-        <w:t xml:space="preserve">Status:</w:t>
-      </w:r>
-      <w:r>
-        <w:t xml:space="preserve"> </w:t>
-      </w:r>
-      <w:r>
-        <w:t xml:space="preserve">rarely moved (both directions).</w:t>
-      </w:r>
-    </w:p>
     <w:bookmarkEnd w:id="77"/>
-    <w:bookmarkStart w:id="78" w:name="Xe257fb82bfc995f1be7e34a341e21ebd0606d23"/>
-    <w:p>
-      <w:pPr>
-        <w:pStyle w:val="Heading2"/>
-      </w:pPr>
-      <w:r>
-        <w:t xml:space="preserve">[P-contractor-accountability] Improve the bidding process and hold contractors accountable</w:t>
-      </w:r>
-    </w:p>
-    <w:p>
-      <w:pPr>
-        <w:numPr>
-          <w:ilvl w:val="0"/>
-          <w:numId w:val="1020"/>
-        </w:numPr>
-        <w:pStyle w:val="Compact"/>
-      </w:pPr>
-      <w:r>
-        <w:rPr>
-          <w:bCs/>
-          <w:b/>
-        </w:rPr>
-        <w:t xml:space="preserve">What citizens said:</w:t>
-      </w:r>
-      <w:r>
-        <w:t xml:space="preserve"> </w:t>
-      </w:r>
-      <w:r>
-        <w:t xml:space="preserve">improve how road and infrastructure contracts are</w:t>
-      </w:r>
-      <w:r>
-        <w:t xml:space="preserve"> </w:t>
-      </w:r>
-      <w:r>
-        <w:t xml:space="preserve">bid and hold contractors accountable for results; medium frequency, high</w:t>
-      </w:r>
-      <w:r>
-        <w:t xml:space="preserve"> </w:t>
-      </w:r>
-      <w:r>
-        <w:t xml:space="preserve">consensus; seen as a low-cost fix.</w:t>
-      </w:r>
-    </w:p>
-    <w:p>
-      <w:pPr>
-        <w:numPr>
-          <w:ilvl w:val="0"/>
-          <w:numId w:val="1020"/>
-        </w:numPr>
-        <w:pStyle w:val="Compact"/>
-      </w:pPr>
-      <w:r>
-        <w:rPr>
-          <w:bCs/>
-          <w:b/>
-        </w:rPr>
-        <w:t xml:space="preserve">What the record shows:</w:t>
-      </w:r>
-      <w:r>
-        <w:t xml:space="preserve"> </w:t>
-      </w:r>
-      <w:r>
-        <w:t xml:space="preserve">the standalone design-build bills died twice</w:t>
-      </w:r>
-      <w:r>
-        <w:t xml:space="preserve"> </w:t>
-      </w:r>
-      <w:r>
-        <w:t xml:space="preserve">in committee — and the method then passed inside the SCDOT Modernization</w:t>
-      </w:r>
-      <w:r>
-        <w:t xml:space="preserve"> </w:t>
-      </w:r>
-      <w:r>
-        <w:t xml:space="preserve">Act (Act 177 of 2026), which gave SCDOT phased design-build and</w:t>
-      </w:r>
-      <w:r>
-        <w:t xml:space="preserve"> </w:t>
-      </w:r>
-      <w:r>
-        <w:t xml:space="preserve">construction manager/general contractor authority, capped public-private</w:t>
-      </w:r>
-      <w:r>
-        <w:t xml:space="preserve"> </w:t>
-      </w:r>
-      <w:r>
-        <w:t xml:space="preserve">partnership agreements at sixty years, and requires an independent</w:t>
-      </w:r>
-      <w:r>
-        <w:t xml:space="preserve"> </w:t>
-      </w:r>
-      <w:r>
-        <w:t xml:space="preserve">external audit of SCDOT every four years. SCDOT’s own contractor</w:t>
-      </w:r>
-      <w:r>
-        <w:t xml:space="preserve"> </w:t>
-      </w:r>
-      <w:r>
-        <w:t xml:space="preserve">performance-evaluation and disqualification regulations were stranded on</w:t>
-      </w:r>
-      <w:r>
-        <w:t xml:space="preserve"> </w:t>
-      </w:r>
-      <w:r>
-        <w:t xml:space="preserve">the 2020 Senate calendar; expenditure-report certification died in Ways</w:t>
-      </w:r>
-      <w:r>
-        <w:t xml:space="preserve"> </w:t>
-      </w:r>
-      <w:r>
-        <w:t xml:space="preserve">and Means. What exists beyond Act 177 is proviso-based transparency:</w:t>
-      </w:r>
-      <w:r>
-        <w:t xml:space="preserve"> </w:t>
-      </w:r>
-      <w:r>
-        <w:t xml:space="preserve">published project priority lists with ranking methodology (renewed</w:t>
-      </w:r>
-      <w:r>
-        <w:t xml:space="preserve"> </w:t>
-      </w:r>
-      <w:r>
-        <w:t xml:space="preserve">yearly) and the public project dashboard directive with</w:t>
-      </w:r>
-      <w:r>
-        <w:t xml:space="preserve"> </w:t>
-      </w:r>
-      <w:r>
-        <w:t xml:space="preserve">forecast-versus-actual costs (FY 2024-25 onward) — one-year rules that</w:t>
-      </w:r>
-      <w:r>
-        <w:t xml:space="preserve"> </w:t>
-      </w:r>
-      <w:r>
-        <w:t xml:space="preserve">lapse if a budget drops them. Edges passed as law: utility-relocation</w:t>
-      </w:r>
-      <w:r>
-        <w:t xml:space="preserve"> </w:t>
-      </w:r>
-      <w:r>
-        <w:t xml:space="preserve">costs (Act 36 of 2019, extended by Act 244 of 2026) and contractor</w:t>
-      </w:r>
-      <w:r>
-        <w:t xml:space="preserve"> </w:t>
-      </w:r>
-      <w:r>
-        <w:t xml:space="preserve">licensing (Act 69 of 2023).</w:t>
-      </w:r>
-    </w:p>
-    <w:p>
-      <w:pPr>
-        <w:numPr>
-          <w:ilvl w:val="0"/>
-          <w:numId w:val="1020"/>
-        </w:numPr>
-        <w:pStyle w:val="Compact"/>
-      </w:pPr>
-      <w:r>
-        <w:rPr>
-          <w:bCs/>
-          <w:b/>
-        </w:rPr>
-        <w:t xml:space="preserve">Status:</w:t>
-      </w:r>
-      <w:r>
-        <w:t xml:space="preserve"> </w:t>
-      </w:r>
-      <w:r>
-        <w:t xml:space="preserve">standalone bills rarely moved; the bidding method and audit</w:t>
-      </w:r>
-      <w:r>
-        <w:t xml:space="preserve"> </w:t>
-      </w:r>
-      <w:r>
-        <w:t xml:space="preserve">were enacted inside Act 177; transparency tools exist as provisos.</w:t>
-      </w:r>
-    </w:p>
-    <w:bookmarkEnd w:id="78"/>
-    <w:bookmarkEnd w:id="79"/>
-    <w:bookmarkStart w:id="83" w:name="appendix-i-sources-and-review-notes"/>
+    <w:bookmarkStart w:id="81" w:name="appendix-i-sources-and-review-notes"/>
     <w:p>
       <w:pPr>
         <w:pStyle w:val="Heading1"/>
@@ -41344,7 +41368,7 @@
         <w:t xml:space="preserve">brief by design.</w:t>
       </w:r>
     </w:p>
-    <w:bookmarkStart w:id="80" w:name="claim-to-source-map"/>
+    <w:bookmarkStart w:id="78" w:name="claim-to-source-map"/>
     <w:p>
       <w:pPr>
         <w:pStyle w:val="Heading2"/>
@@ -41755,7 +41779,7 @@
               <w:jc w:val="left"/>
             </w:pPr>
             <w:r>
-              <w:t xml:space="preserve">Phase 2 Community Conversations dataset</w:t>
+              <w:t xml:space="preserve">The FINAL Phase 2 proposal grid</w:t>
             </w:r>
             <w:r>
               <w:t xml:space="preserve"> </w:t>
@@ -41764,7 +41788,7 @@
               <w:t xml:space="preserve">“</w:t>
             </w:r>
             <w:r>
-              <w:t xml:space="preserve">SC1 – Phase 2 Constituent Proposals – Grid View for Legislators v2</w:t>
+              <w:t xml:space="preserve">SC1 - Growth Infrastructure Roads</w:t>
             </w:r>
             <w:r>
               <w:t xml:space="preserve">”</w:t>
@@ -41773,14 +41797,32 @@
               <w:t xml:space="preserve"> </w:t>
             </w:r>
             <w:r>
-              <w:t xml:space="preserve">via the issue config — process input, not verified fact. Cross-checked against the source document itself on 2026-09-01: six of seven proposal blocks verify (frequency/tradeoffs/consensus); the developer-pays-growth detail table is blank in the v2 document, so its attributes rest on the config’s proposal block alone (noted in Appendix H)</w:t>
+              <w:t xml:space="preserve">(received 2026-09-04; five proposals), which supersedes the draft</w:t>
+            </w:r>
+            <w:r>
+              <w:t xml:space="preserve"> </w:t>
+            </w:r>
+            <w:r>
+              <w:t xml:space="preserve">“</w:t>
+            </w:r>
+            <w:r>
+              <w:t xml:space="preserve">Grid View for Legislators v2</w:t>
+            </w:r>
+            <w:r>
+              <w:t xml:space="preserve">”</w:t>
+            </w:r>
+            <w:r>
+              <w:t xml:space="preserve"> </w:t>
+            </w:r>
+            <w:r>
+              <w:t xml:space="preserve">the config originally carried — process input, not verified fact. All five frequency/tradeoff/consensus descriptions verify against the final grid verbatim in substance. The earlier flag about the draft’s blank developer-pays table is resolved: that proposal is not in the final grid (impact fees are named inside the funding-tools proposal; see Appendix H provenance note)</w:t>
             </w:r>
           </w:p>
         </w:tc>
       </w:tr>
     </w:tbl>
-    <w:bookmarkEnd w:id="80"/>
-    <w:bookmarkStart w:id="81" w:name="collection-and-verification-notes"/>
+    <w:bookmarkEnd w:id="78"/>
+    <w:bookmarkStart w:id="79" w:name="collection-and-verification-notes"/>
     <w:p>
       <w:pPr>
         <w:pStyle w:val="Heading2"/>
@@ -41793,7 +41835,7 @@
       <w:pPr>
         <w:numPr>
           <w:ilvl w:val="0"/>
-          <w:numId w:val="1021"/>
+          <w:numId w:val="1018"/>
         </w:numPr>
         <w:pStyle w:val="Compact"/>
       </w:pPr>
@@ -41829,7 +41871,7 @@
       <w:pPr>
         <w:numPr>
           <w:ilvl w:val="0"/>
-          <w:numId w:val="1021"/>
+          <w:numId w:val="1018"/>
         </w:numPr>
         <w:pStyle w:val="Compact"/>
       </w:pPr>
@@ -41920,7 +41962,7 @@
       <w:pPr>
         <w:numPr>
           <w:ilvl w:val="0"/>
-          <w:numId w:val="1021"/>
+          <w:numId w:val="1018"/>
         </w:numPr>
         <w:pStyle w:val="Compact"/>
       </w:pPr>
@@ -42043,7 +42085,7 @@
       <w:pPr>
         <w:numPr>
           <w:ilvl w:val="0"/>
-          <w:numId w:val="1021"/>
+          <w:numId w:val="1018"/>
         </w:numPr>
         <w:pStyle w:val="Compact"/>
       </w:pPr>
@@ -42094,7 +42136,7 @@
       <w:pPr>
         <w:numPr>
           <w:ilvl w:val="0"/>
-          <w:numId w:val="1021"/>
+          <w:numId w:val="1018"/>
         </w:numPr>
         <w:pStyle w:val="Compact"/>
       </w:pPr>
@@ -42118,7 +42160,7 @@
       <w:pPr>
         <w:numPr>
           <w:ilvl w:val="0"/>
-          <w:numId w:val="1021"/>
+          <w:numId w:val="1018"/>
         </w:numPr>
         <w:pStyle w:val="Compact"/>
       </w:pPr>
@@ -42136,7 +42178,7 @@
       <w:pPr>
         <w:numPr>
           <w:ilvl w:val="0"/>
-          <w:numId w:val="1021"/>
+          <w:numId w:val="1018"/>
         </w:numPr>
         <w:pStyle w:val="Compact"/>
       </w:pPr>
@@ -42156,8 +42198,8 @@
         <w:t xml:space="preserve">no federal filings).</w:t>
       </w:r>
     </w:p>
-    <w:bookmarkEnd w:id="81"/>
-    <w:bookmarkStart w:id="82" w:name="review-status"/>
+    <w:bookmarkEnd w:id="79"/>
+    <w:bookmarkStart w:id="80" w:name="review-status"/>
     <w:p>
       <w:pPr>
         <w:pStyle w:val="Heading2"/>
@@ -42170,7 +42212,7 @@
       <w:pPr>
         <w:numPr>
           <w:ilvl w:val="0"/>
-          <w:numId w:val="1022"/>
+          <w:numId w:val="1019"/>
         </w:numPr>
         <w:pStyle w:val="Compact"/>
       </w:pPr>
@@ -42212,7 +42254,7 @@
       <w:pPr>
         <w:numPr>
           <w:ilvl w:val="0"/>
-          <w:numId w:val="1022"/>
+          <w:numId w:val="1019"/>
         </w:numPr>
         <w:pStyle w:val="Compact"/>
       </w:pPr>
@@ -42220,8 +42262,8 @@
         <w:t xml:space="preserve">Suggested human reviewers: Ryan Echols, Jodi Stephens, Ashley Lovell.</w:t>
       </w:r>
     </w:p>
-    <w:bookmarkEnd w:id="82"/>
-    <w:bookmarkEnd w:id="83"/>
+    <w:bookmarkEnd w:id="80"/>
+    <w:bookmarkEnd w:id="81"/>
     <w:sectPr/>
   </w:body>
 </w:document>
@@ -42404,91 +42446,6 @@
       </w:pPr>
     </w:lvl>
   </w:abstractNum>
-  <w:abstractNum w:abstractNumId="99422022">
-    <w:nsid w:val="A99422022"/>
-    <w:multiLevelType w:val="multilevel"/>
-    <w:lvl w:ilvl="0">
-      <w:start w:val="2022"/>
-      <w:numFmt w:val="decimal"/>
-      <w:lvlText w:val="%1)"/>
-      <w:lvlJc w:val="left"/>
-      <w:pPr>
-        <w:ind w:left="720" w:hanging="480"/>
-      </w:pPr>
-    </w:lvl>
-    <w:lvl w:ilvl="1">
-      <w:start w:val="2022"/>
-      <w:numFmt w:val="decimal"/>
-      <w:lvlText w:val="%2)"/>
-      <w:lvlJc w:val="left"/>
-      <w:pPr>
-        <w:ind w:left="1440" w:hanging="480"/>
-      </w:pPr>
-    </w:lvl>
-    <w:lvl w:ilvl="2">
-      <w:start w:val="2022"/>
-      <w:numFmt w:val="decimal"/>
-      <w:lvlText w:val="%3)"/>
-      <w:lvlJc w:val="left"/>
-      <w:pPr>
-        <w:ind w:left="2160" w:hanging="480"/>
-      </w:pPr>
-    </w:lvl>
-    <w:lvl w:ilvl="3">
-      <w:start w:val="2022"/>
-      <w:numFmt w:val="decimal"/>
-      <w:lvlText w:val="%4)"/>
-      <w:lvlJc w:val="left"/>
-      <w:pPr>
-        <w:ind w:left="2880" w:hanging="480"/>
-      </w:pPr>
-    </w:lvl>
-    <w:lvl w:ilvl="4">
-      <w:start w:val="2022"/>
-      <w:numFmt w:val="decimal"/>
-      <w:lvlText w:val="%5)"/>
-      <w:lvlJc w:val="left"/>
-      <w:pPr>
-        <w:ind w:left="3600" w:hanging="480"/>
-      </w:pPr>
-    </w:lvl>
-    <w:lvl w:ilvl="5">
-      <w:start w:val="2022"/>
-      <w:numFmt w:val="decimal"/>
-      <w:lvlText w:val="%6)"/>
-      <w:lvlJc w:val="left"/>
-      <w:pPr>
-        <w:ind w:left="4320" w:hanging="480"/>
-      </w:pPr>
-    </w:lvl>
-    <w:lvl w:ilvl="6">
-      <w:start w:val="2022"/>
-      <w:numFmt w:val="decimal"/>
-      <w:lvlText w:val="%7)"/>
-      <w:lvlJc w:val="left"/>
-      <w:pPr>
-        <w:ind w:left="5040" w:hanging="480"/>
-      </w:pPr>
-    </w:lvl>
-    <w:lvl w:ilvl="7">
-      <w:start w:val="2022"/>
-      <w:numFmt w:val="decimal"/>
-      <w:lvlText w:val="%8)"/>
-      <w:lvlJc w:val="left"/>
-      <w:pPr>
-        <w:ind w:left="5760" w:hanging="480"/>
-      </w:pPr>
-    </w:lvl>
-    <w:lvl w:ilvl="8">
-      <w:start w:val="2022"/>
-      <w:numFmt w:val="decimal"/>
-      <w:lvlText w:val="%9)"/>
-      <w:lvlJc w:val="left"/>
-      <w:pPr>
-        <w:ind w:left="6480" w:hanging="480"/>
-      </w:pPr>
-    </w:lvl>
-  </w:abstractNum>
   <w:num w:numId="1000">
     <w:abstractNumId w:val="990"/>
   </w:num>
@@ -42532,34 +42489,7 @@
     <w:abstractNumId w:val="991"/>
   </w:num>
   <w:num w:numId="1014">
-    <w:abstractNumId w:val="99422022"/>
-    <w:lvlOverride w:ilvl="0">
-      <w:startOverride w:val="2022"/>
-    </w:lvlOverride>
-    <w:lvlOverride w:ilvl="1">
-      <w:startOverride w:val="2022"/>
-    </w:lvlOverride>
-    <w:lvlOverride w:ilvl="2">
-      <w:startOverride w:val="2022"/>
-    </w:lvlOverride>
-    <w:lvlOverride w:ilvl="3">
-      <w:startOverride w:val="2022"/>
-    </w:lvlOverride>
-    <w:lvlOverride w:ilvl="4">
-      <w:startOverride w:val="2022"/>
-    </w:lvlOverride>
-    <w:lvlOverride w:ilvl="5">
-      <w:startOverride w:val="2022"/>
-    </w:lvlOverride>
-    <w:lvlOverride w:ilvl="6">
-      <w:startOverride w:val="2022"/>
-    </w:lvlOverride>
-    <w:lvlOverride w:ilvl="7">
-      <w:startOverride w:val="2022"/>
-    </w:lvlOverride>
-    <w:lvlOverride w:ilvl="8">
-      <w:startOverride w:val="2022"/>
-    </w:lvlOverride>
+    <w:abstractNumId w:val="991"/>
   </w:num>
   <w:num w:numId="1015">
     <w:abstractNumId w:val="991"/>
@@ -42574,15 +42504,6 @@
     <w:abstractNumId w:val="991"/>
   </w:num>
   <w:num w:numId="1019">
-    <w:abstractNumId w:val="991"/>
-  </w:num>
-  <w:num w:numId="1020">
-    <w:abstractNumId w:val="991"/>
-  </w:num>
-  <w:num w:numId="1021">
-    <w:abstractNumId w:val="991"/>
-  </w:num>
-  <w:num w:numId="1022">
     <w:abstractNumId w:val="991"/>
   </w:num>
 </w:numbering>

</xml_diff>